<commit_message>
Added assignment notebook and report
</commit_message>
<xml_diff>
--- a/M25DE1028_CSL7110_Assignment3.docx
+++ b/M25DE1028_CSL7110_Assignment3.docx
@@ -596,6 +596,9 @@
         <w:jc w:val="both"/>
       </w:pPr>
       <w:r>
+        <w:rPr>
+          <w:noProof/>
+        </w:rPr>
         <w:drawing>
           <wp:inline distT="0" distB="0" distL="0" distR="0" wp14:anchorId="0B711BE7" wp14:editId="404EB0B0">
             <wp:extent cx="5731510" cy="1785620"/>
@@ -655,8 +658,11 @@
     </w:p>
     <w:p>
       <w:r>
+        <w:rPr>
+          <w:noProof/>
+        </w:rPr>
         <w:drawing>
-          <wp:inline distT="0" distB="0" distL="0" distR="0" wp14:anchorId="06C608A5" wp14:editId="5B40A3B0">
+          <wp:inline distT="0" distB="0" distL="0" distR="0" wp14:anchorId="06C608A5" wp14:editId="3ED265E2">
             <wp:extent cx="5731510" cy="1570355"/>
             <wp:effectExtent l="0" t="0" r="2540" b="0"/>
             <wp:docPr id="41737316" name="Picture 1"/>
@@ -693,7 +699,549 @@
       </w:r>
     </w:p>
     <w:p/>
-    <w:p/>
+    <w:p>
+      <w:pPr>
+        <w:rPr>
+          <w:b/>
+          <w:bCs/>
+          <w:sz w:val="28"/>
+          <w:szCs w:val="28"/>
+        </w:rPr>
+      </w:pPr>
+      <w:r>
+        <w:rPr>
+          <w:b/>
+          <w:bCs/>
+          <w:sz w:val="28"/>
+          <w:szCs w:val="28"/>
+        </w:rPr>
+        <w:t>Step 3: Connect GitHub</w:t>
+      </w:r>
+    </w:p>
+    <w:p>
+      <w:r>
+        <w:rPr>
+          <w:noProof/>
+        </w:rPr>
+        <w:drawing>
+          <wp:anchor distT="0" distB="0" distL="114300" distR="114300" simplePos="0" relativeHeight="251660288" behindDoc="0" locked="0" layoutInCell="1" allowOverlap="1" wp14:anchorId="2BCF6C1A" wp14:editId="06B4EE4C">
+            <wp:simplePos x="0" y="0"/>
+            <wp:positionH relativeFrom="margin">
+              <wp:align>left</wp:align>
+            </wp:positionH>
+            <wp:positionV relativeFrom="paragraph">
+              <wp:posOffset>6925</wp:posOffset>
+            </wp:positionV>
+            <wp:extent cx="5731510" cy="1350010"/>
+            <wp:effectExtent l="0" t="0" r="2540" b="2540"/>
+            <wp:wrapNone/>
+            <wp:docPr id="555184283" name="Picture 1"/>
+            <wp:cNvGraphicFramePr>
+              <a:graphicFrameLocks xmlns:a="http://schemas.openxmlformats.org/drawingml/2006/main" noChangeAspect="1"/>
+            </wp:cNvGraphicFramePr>
+            <a:graphic xmlns:a="http://schemas.openxmlformats.org/drawingml/2006/main">
+              <a:graphicData uri="http://schemas.openxmlformats.org/drawingml/2006/picture">
+                <pic:pic xmlns:pic="http://schemas.openxmlformats.org/drawingml/2006/picture">
+                  <pic:nvPicPr>
+                    <pic:cNvPr id="555184283" name=""/>
+                    <pic:cNvPicPr/>
+                  </pic:nvPicPr>
+                  <pic:blipFill>
+                    <a:blip r:embed="rId9">
+                      <a:extLst>
+                        <a:ext uri="{28A0092B-C50C-407E-A947-70E740481C1C}">
+                          <a14:useLocalDpi xmlns:a14="http://schemas.microsoft.com/office/drawing/2010/main" val="0"/>
+                        </a:ext>
+                      </a:extLst>
+                    </a:blip>
+                    <a:stretch>
+                      <a:fillRect/>
+                    </a:stretch>
+                  </pic:blipFill>
+                  <pic:spPr>
+                    <a:xfrm>
+                      <a:off x="0" y="0"/>
+                      <a:ext cx="5731510" cy="1350010"/>
+                    </a:xfrm>
+                    <a:prstGeom prst="rect">
+                      <a:avLst/>
+                    </a:prstGeom>
+                  </pic:spPr>
+                </pic:pic>
+              </a:graphicData>
+            </a:graphic>
+          </wp:anchor>
+        </w:drawing>
+      </w:r>
+    </w:p>
+    <w:p/>
+    <w:p/>
+    <w:p/>
+    <w:p/>
+    <w:p>
+      <w:pPr>
+        <w:rPr>
+          <w:b/>
+          <w:bCs/>
+          <w:sz w:val="28"/>
+          <w:szCs w:val="28"/>
+        </w:rPr>
+      </w:pPr>
+      <w:r>
+        <w:rPr>
+          <w:b/>
+          <w:bCs/>
+          <w:sz w:val="28"/>
+          <w:szCs w:val="28"/>
+        </w:rPr>
+        <w:t xml:space="preserve">Step </w:t>
+      </w:r>
+      <w:r>
+        <w:rPr>
+          <w:b/>
+          <w:bCs/>
+          <w:sz w:val="28"/>
+          <w:szCs w:val="28"/>
+        </w:rPr>
+        <w:t>4</w:t>
+      </w:r>
+      <w:r>
+        <w:rPr>
+          <w:b/>
+          <w:bCs/>
+          <w:sz w:val="28"/>
+          <w:szCs w:val="28"/>
+        </w:rPr>
+        <w:t>: Download Dataset and push</w:t>
+      </w:r>
+    </w:p>
+    <w:p>
+      <w:r>
+        <w:rPr>
+          <w:noProof/>
+        </w:rPr>
+        <w:drawing>
+          <wp:inline distT="0" distB="0" distL="0" distR="0" wp14:anchorId="6E1F7F7A" wp14:editId="7EE7017C">
+            <wp:extent cx="5731510" cy="1772285"/>
+            <wp:effectExtent l="0" t="0" r="2540" b="0"/>
+            <wp:docPr id="892325299" name="Picture 1"/>
+            <wp:cNvGraphicFramePr>
+              <a:graphicFrameLocks xmlns:a="http://schemas.openxmlformats.org/drawingml/2006/main" noChangeAspect="1"/>
+            </wp:cNvGraphicFramePr>
+            <a:graphic xmlns:a="http://schemas.openxmlformats.org/drawingml/2006/main">
+              <a:graphicData uri="http://schemas.openxmlformats.org/drawingml/2006/picture">
+                <pic:pic xmlns:pic="http://schemas.openxmlformats.org/drawingml/2006/picture">
+                  <pic:nvPicPr>
+                    <pic:cNvPr id="892325299" name=""/>
+                    <pic:cNvPicPr/>
+                  </pic:nvPicPr>
+                  <pic:blipFill>
+                    <a:blip r:embed="rId10"/>
+                    <a:stretch>
+                      <a:fillRect/>
+                    </a:stretch>
+                  </pic:blipFill>
+                  <pic:spPr>
+                    <a:xfrm>
+                      <a:off x="0" y="0"/>
+                      <a:ext cx="5731510" cy="1772285"/>
+                    </a:xfrm>
+                    <a:prstGeom prst="rect">
+                      <a:avLst/>
+                    </a:prstGeom>
+                  </pic:spPr>
+                </pic:pic>
+              </a:graphicData>
+            </a:graphic>
+          </wp:inline>
+        </w:drawing>
+      </w:r>
+    </w:p>
+    <w:p/>
+    <w:p/>
+    <w:p/>
+    <w:p/>
+    <w:p/>
+    <w:p/>
+    <w:p/>
+    <w:p/>
+    <w:p/>
+    <w:p/>
+    <w:p/>
+    <w:p/>
+    <w:p/>
+    <w:p/>
+    <w:p/>
+    <w:p/>
+    <w:p/>
+    <w:p/>
+    <w:p/>
+    <w:p/>
+    <w:p/>
+    <w:p/>
+    <w:p>
+      <w:pPr>
+        <w:rPr>
+          <w:b/>
+          <w:bCs/>
+          <w:sz w:val="28"/>
+          <w:szCs w:val="28"/>
+        </w:rPr>
+      </w:pPr>
+      <w:r>
+        <w:rPr>
+          <w:b/>
+          <w:bCs/>
+          <w:sz w:val="28"/>
+          <w:szCs w:val="28"/>
+        </w:rPr>
+        <w:lastRenderedPageBreak/>
+        <w:t>TASK 1:</w:t>
+      </w:r>
+      <w:r>
+        <w:rPr>
+          <w:b/>
+          <w:bCs/>
+          <w:sz w:val="28"/>
+          <w:szCs w:val="28"/>
+        </w:rPr>
+        <w:t xml:space="preserve"> </w:t>
+      </w:r>
+      <w:r>
+        <w:rPr>
+          <w:b/>
+          <w:bCs/>
+          <w:sz w:val="28"/>
+          <w:szCs w:val="28"/>
+        </w:rPr>
+        <w:t>TF-IDF Based Content Recommender</w:t>
+      </w:r>
+    </w:p>
+    <w:p>
+      <w:pPr>
+        <w:jc w:val="both"/>
+        <w:rPr>
+          <w:sz w:val="24"/>
+          <w:szCs w:val="24"/>
+        </w:rPr>
+      </w:pPr>
+      <w:r>
+        <w:rPr>
+          <w:sz w:val="24"/>
+          <w:szCs w:val="24"/>
+        </w:rPr>
+        <w:t>In this task, a content-based recommender system was implemented using TF-IDF (Term Frequency–Inverse Document Frequency) on movie genres. The genres associated with each movie were treated as textual features and transformed into numerical vectors using TF-IDF vectorization.</w:t>
+      </w:r>
+    </w:p>
+    <w:p>
+      <w:pPr>
+        <w:jc w:val="both"/>
+        <w:rPr>
+          <w:sz w:val="24"/>
+          <w:szCs w:val="24"/>
+        </w:rPr>
+      </w:pPr>
+      <w:r>
+        <w:rPr>
+          <w:sz w:val="24"/>
+          <w:szCs w:val="24"/>
+        </w:rPr>
+        <w:t>The similarity between movies was computed using cosine similarity, which measures the angle between two vectors. A higher cosine similarity indicates greater similarity between movies.</w:t>
+      </w:r>
+    </w:p>
+    <w:p>
+      <w:pPr>
+        <w:jc w:val="both"/>
+        <w:rPr>
+          <w:sz w:val="24"/>
+          <w:szCs w:val="24"/>
+        </w:rPr>
+      </w:pPr>
+      <w:r>
+        <w:rPr>
+          <w:sz w:val="24"/>
+          <w:szCs w:val="24"/>
+        </w:rPr>
+        <w:t xml:space="preserve">A recommendation function was developed that takes a movie title as input and returns the </w:t>
+      </w:r>
+      <w:proofErr w:type="gramStart"/>
+      <w:r>
+        <w:rPr>
+          <w:sz w:val="24"/>
+          <w:szCs w:val="24"/>
+        </w:rPr>
+        <w:t>top-N</w:t>
+      </w:r>
+      <w:proofErr w:type="gramEnd"/>
+      <w:r>
+        <w:rPr>
+          <w:sz w:val="24"/>
+          <w:szCs w:val="24"/>
+        </w:rPr>
+        <w:t xml:space="preserve"> most similar movies along with their similarity scores.</w:t>
+      </w:r>
+    </w:p>
+    <w:p>
+      <w:pPr>
+        <w:jc w:val="both"/>
+        <w:rPr>
+          <w:sz w:val="24"/>
+          <w:szCs w:val="24"/>
+        </w:rPr>
+      </w:pPr>
+      <w:r>
+        <w:rPr>
+          <w:sz w:val="24"/>
+          <w:szCs w:val="24"/>
+        </w:rPr>
+        <w:t>The model successfully captures genre-based similarity and provides meaningful recommendations for movies sharing similar themes and categories.</w:t>
+      </w:r>
+    </w:p>
+    <w:p/>
+    <w:p>
+      <w:r>
+        <w:drawing>
+          <wp:inline distT="0" distB="0" distL="0" distR="0" wp14:anchorId="57074FFD" wp14:editId="079C28DB">
+            <wp:extent cx="5731510" cy="2813685"/>
+            <wp:effectExtent l="0" t="0" r="2540" b="5715"/>
+            <wp:docPr id="1088878246" name="Picture 1"/>
+            <wp:cNvGraphicFramePr>
+              <a:graphicFrameLocks xmlns:a="http://schemas.openxmlformats.org/drawingml/2006/main" noChangeAspect="1"/>
+            </wp:cNvGraphicFramePr>
+            <a:graphic xmlns:a="http://schemas.openxmlformats.org/drawingml/2006/main">
+              <a:graphicData uri="http://schemas.openxmlformats.org/drawingml/2006/picture">
+                <pic:pic xmlns:pic="http://schemas.openxmlformats.org/drawingml/2006/picture">
+                  <pic:nvPicPr>
+                    <pic:cNvPr id="1088878246" name=""/>
+                    <pic:cNvPicPr/>
+                  </pic:nvPicPr>
+                  <pic:blipFill>
+                    <a:blip r:embed="rId11"/>
+                    <a:stretch>
+                      <a:fillRect/>
+                    </a:stretch>
+                  </pic:blipFill>
+                  <pic:spPr>
+                    <a:xfrm>
+                      <a:off x="0" y="0"/>
+                      <a:ext cx="5731510" cy="2813685"/>
+                    </a:xfrm>
+                    <a:prstGeom prst="rect">
+                      <a:avLst/>
+                    </a:prstGeom>
+                  </pic:spPr>
+                </pic:pic>
+              </a:graphicData>
+            </a:graphic>
+          </wp:inline>
+        </w:drawing>
+      </w:r>
+    </w:p>
+    <w:p/>
+    <w:p/>
+    <w:p/>
+    <w:p/>
+    <w:p/>
+    <w:p/>
+    <w:p/>
+    <w:p/>
+    <w:p/>
+    <w:p/>
+    <w:p>
+      <w:pPr>
+        <w:rPr>
+          <w:b/>
+          <w:bCs/>
+          <w:sz w:val="28"/>
+          <w:szCs w:val="28"/>
+        </w:rPr>
+      </w:pPr>
+      <w:r>
+        <w:rPr>
+          <w:b/>
+          <w:bCs/>
+          <w:sz w:val="28"/>
+          <w:szCs w:val="28"/>
+        </w:rPr>
+        <w:lastRenderedPageBreak/>
+        <w:t>T</w:t>
+      </w:r>
+      <w:r>
+        <w:rPr>
+          <w:b/>
+          <w:bCs/>
+          <w:sz w:val="28"/>
+          <w:szCs w:val="28"/>
+        </w:rPr>
+        <w:t>ASK</w:t>
+      </w:r>
+      <w:r>
+        <w:rPr>
+          <w:b/>
+          <w:bCs/>
+          <w:sz w:val="28"/>
+          <w:szCs w:val="28"/>
+        </w:rPr>
+        <w:t xml:space="preserve"> 2</w:t>
+      </w:r>
+      <w:r>
+        <w:rPr>
+          <w:b/>
+          <w:bCs/>
+          <w:sz w:val="28"/>
+          <w:szCs w:val="28"/>
+        </w:rPr>
+        <w:t xml:space="preserve">: </w:t>
+      </w:r>
+      <w:r>
+        <w:rPr>
+          <w:b/>
+          <w:bCs/>
+          <w:sz w:val="28"/>
+          <w:szCs w:val="28"/>
+        </w:rPr>
+        <w:t>User Profile Based Recommender</w:t>
+      </w:r>
+    </w:p>
+    <w:p>
+      <w:pPr>
+        <w:jc w:val="both"/>
+        <w:rPr>
+          <w:sz w:val="24"/>
+          <w:szCs w:val="24"/>
+        </w:rPr>
+      </w:pPr>
+      <w:r>
+        <w:rPr>
+          <w:sz w:val="24"/>
+          <w:szCs w:val="24"/>
+        </w:rPr>
+        <w:t>In this task, a personalized content-based recommender system was developed by constructing user profiles from historical ratings. Each user profile was computed as a weighted average of TF-IDF vectors of movies rated by the user.</w:t>
+      </w:r>
+    </w:p>
+    <w:p>
+      <w:pPr>
+        <w:jc w:val="both"/>
+        <w:rPr>
+          <w:sz w:val="24"/>
+          <w:szCs w:val="24"/>
+        </w:rPr>
+      </w:pPr>
+      <w:r>
+        <w:rPr>
+          <w:sz w:val="24"/>
+          <w:szCs w:val="24"/>
+        </w:rPr>
+        <w:t>The weights correspond to the ratings given by the user, ensuring that highly rated movies contribute more to the profile. The user profile vector captures the overall preferences of the user in terms of genres.</w:t>
+      </w:r>
+    </w:p>
+    <w:p>
+      <w:pPr>
+        <w:jc w:val="both"/>
+        <w:rPr>
+          <w:sz w:val="24"/>
+          <w:szCs w:val="24"/>
+        </w:rPr>
+      </w:pPr>
+      <w:r>
+        <w:rPr>
+          <w:sz w:val="24"/>
+          <w:szCs w:val="24"/>
+        </w:rPr>
+        <w:t xml:space="preserve">Cosine similarity was then computed between the user profile and all movie vectors to generate recommendations. Movies were ranked based on similarity scores and the </w:t>
+      </w:r>
+      <w:proofErr w:type="gramStart"/>
+      <w:r>
+        <w:rPr>
+          <w:sz w:val="24"/>
+          <w:szCs w:val="24"/>
+        </w:rPr>
+        <w:t>top-N</w:t>
+      </w:r>
+      <w:proofErr w:type="gramEnd"/>
+      <w:r>
+        <w:rPr>
+          <w:sz w:val="24"/>
+          <w:szCs w:val="24"/>
+        </w:rPr>
+        <w:t xml:space="preserve"> recommendations were returned.</w:t>
+      </w:r>
+    </w:p>
+    <w:p>
+      <w:pPr>
+        <w:jc w:val="both"/>
+        <w:rPr>
+          <w:sz w:val="24"/>
+          <w:szCs w:val="24"/>
+        </w:rPr>
+      </w:pPr>
+      <w:r>
+        <w:rPr>
+          <w:sz w:val="24"/>
+          <w:szCs w:val="24"/>
+        </w:rPr>
+        <w:t>This approach introduces personalization into the recommendation process and performs better than basic content-based filtering.</w:t>
+      </w:r>
+    </w:p>
+    <w:p>
+      <w:pPr>
+        <w:jc w:val="both"/>
+        <w:rPr>
+          <w:sz w:val="24"/>
+          <w:szCs w:val="24"/>
+        </w:rPr>
+      </w:pPr>
+    </w:p>
+    <w:p>
+      <w:pPr>
+        <w:jc w:val="both"/>
+        <w:rPr>
+          <w:sz w:val="24"/>
+          <w:szCs w:val="24"/>
+        </w:rPr>
+      </w:pPr>
+      <w:r>
+        <w:rPr>
+          <w:sz w:val="24"/>
+          <w:szCs w:val="24"/>
+        </w:rPr>
+        <w:drawing>
+          <wp:inline distT="0" distB="0" distL="0" distR="0" wp14:anchorId="4E1FA613" wp14:editId="068A078E">
+            <wp:extent cx="5731510" cy="1470025"/>
+            <wp:effectExtent l="0" t="0" r="2540" b="0"/>
+            <wp:docPr id="782300615" name="Picture 1"/>
+            <wp:cNvGraphicFramePr>
+              <a:graphicFrameLocks xmlns:a="http://schemas.openxmlformats.org/drawingml/2006/main" noChangeAspect="1"/>
+            </wp:cNvGraphicFramePr>
+            <a:graphic xmlns:a="http://schemas.openxmlformats.org/drawingml/2006/main">
+              <a:graphicData uri="http://schemas.openxmlformats.org/drawingml/2006/picture">
+                <pic:pic xmlns:pic="http://schemas.openxmlformats.org/drawingml/2006/picture">
+                  <pic:nvPicPr>
+                    <pic:cNvPr id="782300615" name=""/>
+                    <pic:cNvPicPr/>
+                  </pic:nvPicPr>
+                  <pic:blipFill>
+                    <a:blip r:embed="rId12"/>
+                    <a:stretch>
+                      <a:fillRect/>
+                    </a:stretch>
+                  </pic:blipFill>
+                  <pic:spPr>
+                    <a:xfrm>
+                      <a:off x="0" y="0"/>
+                      <a:ext cx="5731510" cy="1470025"/>
+                    </a:xfrm>
+                    <a:prstGeom prst="rect">
+                      <a:avLst/>
+                    </a:prstGeom>
+                  </pic:spPr>
+                </pic:pic>
+              </a:graphicData>
+            </a:graphic>
+          </wp:inline>
+        </w:drawing>
+      </w:r>
+    </w:p>
     <w:sectPr>
       <w:pgSz w:w="11906" w:h="16838"/>
       <w:pgMar w:top="1440" w:right="1440" w:bottom="1440" w:left="1440" w:header="708" w:footer="708" w:gutter="0"/>

</xml_diff>

<commit_message>
Implemented user-based collaborative filtering
</commit_message>
<xml_diff>
--- a/M25DE1028_CSL7110_Assignment3.docx
+++ b/M25DE1028_CSL7110_Assignment3.docx
@@ -463,15 +463,7 @@
       </w:pPr>
       <w:r>
         <w:lastRenderedPageBreak/>
-        <w:t xml:space="preserve">The </w:t>
-      </w:r>
-      <w:proofErr w:type="spellStart"/>
-      <w:r>
-        <w:t>MovieLens</w:t>
-      </w:r>
-      <w:proofErr w:type="spellEnd"/>
-      <w:r>
-        <w:t xml:space="preserve"> dataset is a widely used benchmark dataset for recommender system research. It contains user ratings for movies along with movie metadata such as title and genres.</w:t>
+        <w:t>The MovieLens dataset is a widely used benchmark dataset for recommender system research. It contains user ratings for movies along with movie metadata such as title and genres.</w:t>
       </w:r>
     </w:p>
     <w:p>
@@ -481,21 +473,12 @@
       <w:r>
         <w:t xml:space="preserve">For this assignment, the </w:t>
       </w:r>
-      <w:proofErr w:type="spellStart"/>
-      <w:r>
-        <w:rPr>
-          <w:b/>
-          <w:bCs/>
-        </w:rPr>
-        <w:t>MovieLens</w:t>
-      </w:r>
-      <w:proofErr w:type="spellEnd"/>
-      <w:r>
-        <w:rPr>
-          <w:b/>
-          <w:bCs/>
-        </w:rPr>
-        <w:t xml:space="preserve"> Latest Small dataset</w:t>
+      <w:r>
+        <w:rPr>
+          <w:b/>
+          <w:bCs/>
+        </w:rPr>
+        <w:t>MovieLens Latest Small dataset</w:t>
       </w:r>
       <w:r>
         <w:t xml:space="preserve"> was used. The dataset contains approximately 100,000 ratings from around 600 users on nearly 9,000 movies.</w:t>
@@ -518,15 +501,7 @@
         <w:t>movies.csv</w:t>
       </w:r>
       <w:r>
-        <w:t xml:space="preserve"> – contains </w:t>
-      </w:r>
-      <w:proofErr w:type="spellStart"/>
-      <w:r>
-        <w:t>movieId</w:t>
-      </w:r>
-      <w:proofErr w:type="spellEnd"/>
-      <w:r>
-        <w:t>, movie title, and genres</w:t>
+        <w:t xml:space="preserve"> – contains movieId, movie title, and genres</w:t>
       </w:r>
       <w:r>
         <w:br/>
@@ -539,23 +514,7 @@
         <w:t>ratings.csv</w:t>
       </w:r>
       <w:r>
-        <w:t xml:space="preserve"> – contains </w:t>
-      </w:r>
-      <w:proofErr w:type="spellStart"/>
-      <w:r>
-        <w:t>userId</w:t>
-      </w:r>
-      <w:proofErr w:type="spellEnd"/>
-      <w:r>
-        <w:t xml:space="preserve">, </w:t>
-      </w:r>
-      <w:proofErr w:type="spellStart"/>
-      <w:r>
-        <w:t>movieId</w:t>
-      </w:r>
-      <w:proofErr w:type="spellEnd"/>
-      <w:r>
-        <w:t>, rating, and timestamp</w:t>
+        <w:t xml:space="preserve"> – contains userId, movieId, rating, and timestamp</w:t>
       </w:r>
     </w:p>
     <w:p>
@@ -962,23 +921,7 @@
           <w:sz w:val="24"/>
           <w:szCs w:val="24"/>
         </w:rPr>
-        <w:t xml:space="preserve">A recommendation function was developed that takes a movie title as input and returns the </w:t>
-      </w:r>
-      <w:proofErr w:type="gramStart"/>
-      <w:r>
-        <w:rPr>
-          <w:sz w:val="24"/>
-          <w:szCs w:val="24"/>
-        </w:rPr>
-        <w:t>top-N</w:t>
-      </w:r>
-      <w:proofErr w:type="gramEnd"/>
-      <w:r>
-        <w:rPr>
-          <w:sz w:val="24"/>
-          <w:szCs w:val="24"/>
-        </w:rPr>
-        <w:t xml:space="preserve"> most similar movies along with their similarity scores.</w:t>
+        <w:t>A recommendation function was developed that takes a movie title as input and returns the top-N most similar movies along with their similarity scores.</w:t>
       </w:r>
     </w:p>
     <w:p>
@@ -1148,23 +1091,7 @@
           <w:sz w:val="24"/>
           <w:szCs w:val="24"/>
         </w:rPr>
-        <w:t xml:space="preserve">Cosine similarity was then computed between the user profile and all movie vectors to generate recommendations. Movies were ranked based on similarity scores and the </w:t>
-      </w:r>
-      <w:proofErr w:type="gramStart"/>
-      <w:r>
-        <w:rPr>
-          <w:sz w:val="24"/>
-          <w:szCs w:val="24"/>
-        </w:rPr>
-        <w:t>top-N</w:t>
-      </w:r>
-      <w:proofErr w:type="gramEnd"/>
-      <w:r>
-        <w:rPr>
-          <w:sz w:val="24"/>
-          <w:szCs w:val="24"/>
-        </w:rPr>
-        <w:t xml:space="preserve"> recommendations were returned.</w:t>
+        <w:t>Cosine similarity was then computed between the user profile and all movie vectors to generate recommendations. Movies were ranked based on similarity scores and the top-N recommendations were returned.</w:t>
       </w:r>
     </w:p>
     <w:p>
@@ -1230,6 +1157,298 @@
                     <a:xfrm>
                       <a:off x="0" y="0"/>
                       <a:ext cx="5731510" cy="1470025"/>
+                    </a:xfrm>
+                    <a:prstGeom prst="rect">
+                      <a:avLst/>
+                    </a:prstGeom>
+                  </pic:spPr>
+                </pic:pic>
+              </a:graphicData>
+            </a:graphic>
+          </wp:inline>
+        </w:drawing>
+      </w:r>
+    </w:p>
+    <w:p>
+      <w:pPr>
+        <w:jc w:val="both"/>
+        <w:rPr>
+          <w:sz w:val="24"/>
+          <w:szCs w:val="24"/>
+        </w:rPr>
+      </w:pPr>
+    </w:p>
+    <w:p>
+      <w:pPr>
+        <w:jc w:val="both"/>
+        <w:rPr>
+          <w:sz w:val="24"/>
+          <w:szCs w:val="24"/>
+        </w:rPr>
+      </w:pPr>
+    </w:p>
+    <w:p>
+      <w:pPr>
+        <w:jc w:val="both"/>
+        <w:rPr>
+          <w:sz w:val="24"/>
+          <w:szCs w:val="24"/>
+        </w:rPr>
+      </w:pPr>
+    </w:p>
+    <w:p>
+      <w:pPr>
+        <w:jc w:val="both"/>
+        <w:rPr>
+          <w:sz w:val="24"/>
+          <w:szCs w:val="24"/>
+        </w:rPr>
+      </w:pPr>
+    </w:p>
+    <w:p>
+      <w:pPr>
+        <w:jc w:val="both"/>
+        <w:rPr>
+          <w:sz w:val="24"/>
+          <w:szCs w:val="24"/>
+        </w:rPr>
+      </w:pPr>
+    </w:p>
+    <w:p>
+      <w:pPr>
+        <w:jc w:val="both"/>
+        <w:rPr>
+          <w:sz w:val="24"/>
+          <w:szCs w:val="24"/>
+        </w:rPr>
+      </w:pPr>
+    </w:p>
+    <w:p>
+      <w:pPr>
+        <w:jc w:val="both"/>
+        <w:rPr>
+          <w:sz w:val="24"/>
+          <w:szCs w:val="24"/>
+        </w:rPr>
+      </w:pPr>
+    </w:p>
+    <w:p>
+      <w:pPr>
+        <w:jc w:val="both"/>
+        <w:rPr>
+          <w:sz w:val="24"/>
+          <w:szCs w:val="24"/>
+        </w:rPr>
+      </w:pPr>
+    </w:p>
+    <w:p>
+      <w:pPr>
+        <w:jc w:val="both"/>
+        <w:rPr>
+          <w:sz w:val="24"/>
+          <w:szCs w:val="24"/>
+        </w:rPr>
+      </w:pPr>
+    </w:p>
+    <w:p>
+      <w:pPr>
+        <w:jc w:val="both"/>
+        <w:rPr>
+          <w:sz w:val="24"/>
+          <w:szCs w:val="24"/>
+        </w:rPr>
+      </w:pPr>
+    </w:p>
+    <w:p>
+      <w:pPr>
+        <w:jc w:val="both"/>
+        <w:rPr>
+          <w:sz w:val="24"/>
+          <w:szCs w:val="24"/>
+        </w:rPr>
+      </w:pPr>
+    </w:p>
+    <w:p>
+      <w:pPr>
+        <w:jc w:val="both"/>
+        <w:rPr>
+          <w:sz w:val="24"/>
+          <w:szCs w:val="24"/>
+        </w:rPr>
+      </w:pPr>
+    </w:p>
+    <w:p>
+      <w:pPr>
+        <w:jc w:val="both"/>
+        <w:rPr>
+          <w:sz w:val="24"/>
+          <w:szCs w:val="24"/>
+        </w:rPr>
+      </w:pPr>
+    </w:p>
+    <w:p>
+      <w:pPr>
+        <w:jc w:val="both"/>
+        <w:rPr>
+          <w:b/>
+          <w:bCs/>
+          <w:sz w:val="28"/>
+          <w:szCs w:val="28"/>
+        </w:rPr>
+      </w:pPr>
+      <w:r>
+        <w:rPr>
+          <w:b/>
+          <w:bCs/>
+          <w:sz w:val="28"/>
+          <w:szCs w:val="28"/>
+        </w:rPr>
+        <w:lastRenderedPageBreak/>
+        <w:t>T</w:t>
+      </w:r>
+      <w:r>
+        <w:rPr>
+          <w:b/>
+          <w:bCs/>
+          <w:sz w:val="28"/>
+          <w:szCs w:val="28"/>
+        </w:rPr>
+        <w:t>ASK</w:t>
+      </w:r>
+      <w:r>
+        <w:rPr>
+          <w:b/>
+          <w:bCs/>
+          <w:sz w:val="28"/>
+          <w:szCs w:val="28"/>
+        </w:rPr>
+        <w:t xml:space="preserve"> 3</w:t>
+      </w:r>
+      <w:r>
+        <w:rPr>
+          <w:b/>
+          <w:bCs/>
+          <w:sz w:val="28"/>
+          <w:szCs w:val="28"/>
+        </w:rPr>
+        <w:t>:</w:t>
+      </w:r>
+      <w:r>
+        <w:rPr>
+          <w:b/>
+          <w:bCs/>
+          <w:sz w:val="28"/>
+          <w:szCs w:val="28"/>
+        </w:rPr>
+        <w:t xml:space="preserve"> User-Based Collaborative Filtering</w:t>
+      </w:r>
+    </w:p>
+    <w:p>
+      <w:pPr>
+        <w:jc w:val="both"/>
+        <w:rPr>
+          <w:sz w:val="24"/>
+          <w:szCs w:val="24"/>
+        </w:rPr>
+      </w:pPr>
+      <w:r>
+        <w:rPr>
+          <w:sz w:val="24"/>
+          <w:szCs w:val="24"/>
+        </w:rPr>
+        <w:t>In this task, a user-based collaborative filtering approach was implemented using the Surprise library. The model computes similarity between users based on their rating patterns.</w:t>
+      </w:r>
+    </w:p>
+    <w:p>
+      <w:pPr>
+        <w:jc w:val="both"/>
+        <w:rPr>
+          <w:sz w:val="24"/>
+          <w:szCs w:val="24"/>
+        </w:rPr>
+      </w:pPr>
+      <w:r>
+        <w:rPr>
+          <w:sz w:val="24"/>
+          <w:szCs w:val="24"/>
+        </w:rPr>
+        <w:t>A K-Nearest Neighbors (KNN) algorithm with cosine similarity was used to identify similar users. The predicted rating for a user-item pair was computed as a weighted average of ratings from similar users.</w:t>
+      </w:r>
+    </w:p>
+    <w:p>
+      <w:pPr>
+        <w:jc w:val="both"/>
+        <w:rPr>
+          <w:sz w:val="24"/>
+          <w:szCs w:val="24"/>
+        </w:rPr>
+      </w:pPr>
+      <w:r>
+        <w:rPr>
+          <w:sz w:val="24"/>
+          <w:szCs w:val="24"/>
+        </w:rPr>
+        <w:t>The model was evaluated using Root Mean Square Error (RMSE), which measures the difference between predicted and actual ratings.</w:t>
+      </w:r>
+    </w:p>
+    <w:p>
+      <w:pPr>
+        <w:jc w:val="both"/>
+        <w:rPr>
+          <w:sz w:val="24"/>
+          <w:szCs w:val="24"/>
+        </w:rPr>
+      </w:pPr>
+      <w:r>
+        <w:rPr>
+          <w:sz w:val="24"/>
+          <w:szCs w:val="24"/>
+        </w:rPr>
+        <w:t>Based on predicted ratings, top-N recommendations were generated for each user. This approach captures collaborative behavior and provides more personalized recommendations compared to content-based methods.</w:t>
+      </w:r>
+    </w:p>
+    <w:p>
+      <w:pPr>
+        <w:jc w:val="both"/>
+        <w:rPr>
+          <w:b/>
+          <w:bCs/>
+          <w:sz w:val="28"/>
+          <w:szCs w:val="28"/>
+        </w:rPr>
+      </w:pPr>
+      <w:r>
+        <w:rPr>
+          <w:b/>
+          <w:bCs/>
+          <w:sz w:val="28"/>
+          <w:szCs w:val="28"/>
+        </w:rPr>
+        <w:drawing>
+          <wp:inline distT="0" distB="0" distL="0" distR="0" wp14:anchorId="63609401" wp14:editId="14F5F83A">
+            <wp:extent cx="5731510" cy="1057910"/>
+            <wp:effectExtent l="0" t="0" r="2540" b="8890"/>
+            <wp:docPr id="1196753302" name="Picture 1"/>
+            <wp:cNvGraphicFramePr>
+              <a:graphicFrameLocks xmlns:a="http://schemas.openxmlformats.org/drawingml/2006/main" noChangeAspect="1"/>
+            </wp:cNvGraphicFramePr>
+            <a:graphic xmlns:a="http://schemas.openxmlformats.org/drawingml/2006/main">
+              <a:graphicData uri="http://schemas.openxmlformats.org/drawingml/2006/picture">
+                <pic:pic xmlns:pic="http://schemas.openxmlformats.org/drawingml/2006/picture">
+                  <pic:nvPicPr>
+                    <pic:cNvPr id="1196753302" name=""/>
+                    <pic:cNvPicPr/>
+                  </pic:nvPicPr>
+                  <pic:blipFill>
+                    <a:blip r:embed="rId13"/>
+                    <a:stretch>
+                      <a:fillRect/>
+                    </a:stretch>
+                  </pic:blipFill>
+                  <pic:spPr>
+                    <a:xfrm>
+                      <a:off x="0" y="0"/>
+                      <a:ext cx="5731510" cy="1057910"/>
                     </a:xfrm>
                     <a:prstGeom prst="rect">
                       <a:avLst/>

</xml_diff>

<commit_message>
Implemented SVD model-based collaborative filtering
</commit_message>
<xml_diff>
--- a/M25DE1028_CSL7110_Assignment3.docx
+++ b/M25DE1028_CSL7110_Assignment3.docx
@@ -463,7 +463,15 @@
       </w:pPr>
       <w:r>
         <w:lastRenderedPageBreak/>
-        <w:t>The MovieLens dataset is a widely used benchmark dataset for recommender system research. It contains user ratings for movies along with movie metadata such as title and genres.</w:t>
+        <w:t xml:space="preserve">The </w:t>
+      </w:r>
+      <w:proofErr w:type="spellStart"/>
+      <w:r>
+        <w:t>MovieLens</w:t>
+      </w:r>
+      <w:proofErr w:type="spellEnd"/>
+      <w:r>
+        <w:t xml:space="preserve"> dataset is a widely used benchmark dataset for recommender system research. It contains user ratings for movies along with movie metadata such as title and genres.</w:t>
       </w:r>
     </w:p>
     <w:p>
@@ -473,12 +481,21 @@
       <w:r>
         <w:t xml:space="preserve">For this assignment, the </w:t>
       </w:r>
-      <w:r>
-        <w:rPr>
-          <w:b/>
-          <w:bCs/>
-        </w:rPr>
-        <w:t>MovieLens Latest Small dataset</w:t>
+      <w:proofErr w:type="spellStart"/>
+      <w:r>
+        <w:rPr>
+          <w:b/>
+          <w:bCs/>
+        </w:rPr>
+        <w:t>MovieLens</w:t>
+      </w:r>
+      <w:proofErr w:type="spellEnd"/>
+      <w:r>
+        <w:rPr>
+          <w:b/>
+          <w:bCs/>
+        </w:rPr>
+        <w:t xml:space="preserve"> Latest Small dataset</w:t>
       </w:r>
       <w:r>
         <w:t xml:space="preserve"> was used. The dataset contains approximately 100,000 ratings from around 600 users on nearly 9,000 movies.</w:t>
@@ -501,7 +518,15 @@
         <w:t>movies.csv</w:t>
       </w:r>
       <w:r>
-        <w:t xml:space="preserve"> – contains movieId, movie title, and genres</w:t>
+        <w:t xml:space="preserve"> – contains </w:t>
+      </w:r>
+      <w:proofErr w:type="spellStart"/>
+      <w:r>
+        <w:t>movieId</w:t>
+      </w:r>
+      <w:proofErr w:type="spellEnd"/>
+      <w:r>
+        <w:t>, movie title, and genres</w:t>
       </w:r>
       <w:r>
         <w:br/>
@@ -514,7 +539,23 @@
         <w:t>ratings.csv</w:t>
       </w:r>
       <w:r>
-        <w:t xml:space="preserve"> – contains userId, movieId, rating, and timestamp</w:t>
+        <w:t xml:space="preserve"> – contains </w:t>
+      </w:r>
+      <w:proofErr w:type="spellStart"/>
+      <w:r>
+        <w:t>userId</w:t>
+      </w:r>
+      <w:proofErr w:type="spellEnd"/>
+      <w:r>
+        <w:t xml:space="preserve">, </w:t>
+      </w:r>
+      <w:proofErr w:type="spellStart"/>
+      <w:r>
+        <w:t>movieId</w:t>
+      </w:r>
+      <w:proofErr w:type="spellEnd"/>
+      <w:r>
+        <w:t>, rating, and timestamp</w:t>
       </w:r>
     </w:p>
     <w:p>
@@ -921,7 +962,23 @@
           <w:sz w:val="24"/>
           <w:szCs w:val="24"/>
         </w:rPr>
-        <w:t>A recommendation function was developed that takes a movie title as input and returns the top-N most similar movies along with their similarity scores.</w:t>
+        <w:t xml:space="preserve">A recommendation function was developed that takes a movie title as input and returns the </w:t>
+      </w:r>
+      <w:proofErr w:type="gramStart"/>
+      <w:r>
+        <w:rPr>
+          <w:sz w:val="24"/>
+          <w:szCs w:val="24"/>
+        </w:rPr>
+        <w:t>top-N</w:t>
+      </w:r>
+      <w:proofErr w:type="gramEnd"/>
+      <w:r>
+        <w:rPr>
+          <w:sz w:val="24"/>
+          <w:szCs w:val="24"/>
+        </w:rPr>
+        <w:t xml:space="preserve"> most similar movies along with their similarity scores.</w:t>
       </w:r>
     </w:p>
     <w:p>
@@ -1091,7 +1148,23 @@
           <w:sz w:val="24"/>
           <w:szCs w:val="24"/>
         </w:rPr>
-        <w:t>Cosine similarity was then computed between the user profile and all movie vectors to generate recommendations. Movies were ranked based on similarity scores and the top-N recommendations were returned.</w:t>
+        <w:t xml:space="preserve">Cosine similarity was then computed between the user profile and all movie vectors to generate recommendations. Movies were ranked based on similarity scores and the </w:t>
+      </w:r>
+      <w:proofErr w:type="gramStart"/>
+      <w:r>
+        <w:rPr>
+          <w:sz w:val="24"/>
+          <w:szCs w:val="24"/>
+        </w:rPr>
+        <w:t>top-N</w:t>
+      </w:r>
+      <w:proofErr w:type="gramEnd"/>
+      <w:r>
+        <w:rPr>
+          <w:sz w:val="24"/>
+          <w:szCs w:val="24"/>
+        </w:rPr>
+        <w:t xml:space="preserve"> recommendations were returned.</w:t>
       </w:r>
     </w:p>
     <w:p>
@@ -1133,7 +1206,7 @@
           <w:szCs w:val="24"/>
         </w:rPr>
         <w:drawing>
-          <wp:inline distT="0" distB="0" distL="0" distR="0" wp14:anchorId="4E1FA613" wp14:editId="068A078E">
+          <wp:inline distT="0" distB="0" distL="0" distR="0" wp14:anchorId="4E1FA613" wp14:editId="54AFC7DF">
             <wp:extent cx="5731510" cy="1470025"/>
             <wp:effectExtent l="0" t="0" r="2540" b="0"/>
             <wp:docPr id="782300615" name="Picture 1"/>
@@ -1182,128 +1255,19 @@
       <w:pPr>
         <w:jc w:val="both"/>
         <w:rPr>
-          <w:sz w:val="24"/>
-          <w:szCs w:val="24"/>
-        </w:rPr>
-      </w:pPr>
-    </w:p>
-    <w:p>
-      <w:pPr>
-        <w:jc w:val="both"/>
-        <w:rPr>
-          <w:sz w:val="24"/>
-          <w:szCs w:val="24"/>
-        </w:rPr>
-      </w:pPr>
-    </w:p>
-    <w:p>
-      <w:pPr>
-        <w:jc w:val="both"/>
-        <w:rPr>
-          <w:sz w:val="24"/>
-          <w:szCs w:val="24"/>
-        </w:rPr>
-      </w:pPr>
-    </w:p>
-    <w:p>
-      <w:pPr>
-        <w:jc w:val="both"/>
-        <w:rPr>
-          <w:sz w:val="24"/>
-          <w:szCs w:val="24"/>
-        </w:rPr>
-      </w:pPr>
-    </w:p>
-    <w:p>
-      <w:pPr>
-        <w:jc w:val="both"/>
-        <w:rPr>
-          <w:sz w:val="24"/>
-          <w:szCs w:val="24"/>
-        </w:rPr>
-      </w:pPr>
-    </w:p>
-    <w:p>
-      <w:pPr>
-        <w:jc w:val="both"/>
-        <w:rPr>
-          <w:sz w:val="24"/>
-          <w:szCs w:val="24"/>
-        </w:rPr>
-      </w:pPr>
-    </w:p>
-    <w:p>
-      <w:pPr>
-        <w:jc w:val="both"/>
-        <w:rPr>
-          <w:sz w:val="24"/>
-          <w:szCs w:val="24"/>
-        </w:rPr>
-      </w:pPr>
-    </w:p>
-    <w:p>
-      <w:pPr>
-        <w:jc w:val="both"/>
-        <w:rPr>
-          <w:sz w:val="24"/>
-          <w:szCs w:val="24"/>
-        </w:rPr>
-      </w:pPr>
-    </w:p>
-    <w:p>
-      <w:pPr>
-        <w:jc w:val="both"/>
-        <w:rPr>
-          <w:sz w:val="24"/>
-          <w:szCs w:val="24"/>
-        </w:rPr>
-      </w:pPr>
-    </w:p>
-    <w:p>
-      <w:pPr>
-        <w:jc w:val="both"/>
-        <w:rPr>
-          <w:sz w:val="24"/>
-          <w:szCs w:val="24"/>
-        </w:rPr>
-      </w:pPr>
-    </w:p>
-    <w:p>
-      <w:pPr>
-        <w:jc w:val="both"/>
-        <w:rPr>
-          <w:sz w:val="24"/>
-          <w:szCs w:val="24"/>
-        </w:rPr>
-      </w:pPr>
-    </w:p>
-    <w:p>
-      <w:pPr>
-        <w:jc w:val="both"/>
-        <w:rPr>
-          <w:sz w:val="24"/>
-          <w:szCs w:val="24"/>
-        </w:rPr>
-      </w:pPr>
-    </w:p>
-    <w:p>
-      <w:pPr>
-        <w:jc w:val="both"/>
-        <w:rPr>
-          <w:b/>
-          <w:bCs/>
-          <w:sz w:val="28"/>
-          <w:szCs w:val="28"/>
-        </w:rPr>
-      </w:pPr>
-      <w:r>
-        <w:rPr>
-          <w:b/>
-          <w:bCs/>
-          <w:sz w:val="28"/>
-          <w:szCs w:val="28"/>
-        </w:rPr>
-        <w:lastRenderedPageBreak/>
+          <w:b/>
+          <w:bCs/>
+          <w:sz w:val="28"/>
+          <w:szCs w:val="28"/>
+        </w:rPr>
+      </w:pPr>
+      <w:r>
+        <w:rPr>
+          <w:b/>
+          <w:bCs/>
+          <w:sz w:val="28"/>
+          <w:szCs w:val="28"/>
+        </w:rPr>
         <w:t>T</w:t>
       </w:r>
       <w:r>
@@ -1372,7 +1336,21 @@
           <w:sz w:val="24"/>
           <w:szCs w:val="24"/>
         </w:rPr>
-        <w:t>A K-Nearest Neighbors (KNN) algorithm with cosine similarity was used to identify similar users. The predicted rating for a user-item pair was computed as a weighted average of ratings from similar users.</w:t>
+        <w:t xml:space="preserve">A K-Nearest </w:t>
+      </w:r>
+      <w:r>
+        <w:rPr>
+          <w:sz w:val="24"/>
+          <w:szCs w:val="24"/>
+        </w:rPr>
+        <w:t>Neighbours</w:t>
+      </w:r>
+      <w:r>
+        <w:rPr>
+          <w:sz w:val="24"/>
+          <w:szCs w:val="24"/>
+        </w:rPr>
+        <w:t xml:space="preserve"> (KNN) algorithm with cosine similarity was used to identify similar users. The predicted rating for a user-item pair was computed as a weighted average of ratings from similar users.</w:t>
       </w:r>
     </w:p>
     <w:p>
@@ -1404,7 +1382,21 @@
           <w:sz w:val="24"/>
           <w:szCs w:val="24"/>
         </w:rPr>
-        <w:t>Based on predicted ratings, top-N recommendations were generated for each user. This approach captures collaborative behavior and provides more personalized recommendations compared to content-based methods.</w:t>
+        <w:t xml:space="preserve">Based on predicted ratings, top-N recommendations were generated for each user. This approach captures collaborative </w:t>
+      </w:r>
+      <w:r>
+        <w:rPr>
+          <w:sz w:val="24"/>
+          <w:szCs w:val="24"/>
+        </w:rPr>
+        <w:t>behaviour</w:t>
+      </w:r>
+      <w:r>
+        <w:rPr>
+          <w:sz w:val="24"/>
+          <w:szCs w:val="24"/>
+        </w:rPr>
+        <w:t xml:space="preserve"> and provides more personalized recommendations compared to content-based methods.</w:t>
       </w:r>
     </w:p>
     <w:p>
@@ -1425,9 +1417,17 @@
           <w:szCs w:val="28"/>
         </w:rPr>
         <w:drawing>
-          <wp:inline distT="0" distB="0" distL="0" distR="0" wp14:anchorId="63609401" wp14:editId="14F5F83A">
+          <wp:anchor distT="0" distB="0" distL="114300" distR="114300" simplePos="0" relativeHeight="251661312" behindDoc="0" locked="0" layoutInCell="1" allowOverlap="1" wp14:anchorId="63609401" wp14:editId="0FE8D408">
+            <wp:simplePos x="0" y="0"/>
+            <wp:positionH relativeFrom="margin">
+              <wp:align>right</wp:align>
+            </wp:positionH>
+            <wp:positionV relativeFrom="paragraph">
+              <wp:posOffset>255905</wp:posOffset>
+            </wp:positionV>
             <wp:extent cx="5731510" cy="1057910"/>
             <wp:effectExtent l="0" t="0" r="2540" b="8890"/>
+            <wp:wrapNone/>
             <wp:docPr id="1196753302" name="Picture 1"/>
             <wp:cNvGraphicFramePr>
               <a:graphicFrameLocks xmlns:a="http://schemas.openxmlformats.org/drawingml/2006/main" noChangeAspect="1"/>
@@ -1440,7 +1440,13 @@
                     <pic:cNvPicPr/>
                   </pic:nvPicPr>
                   <pic:blipFill>
-                    <a:blip r:embed="rId13"/>
+                    <a:blip r:embed="rId13">
+                      <a:extLst>
+                        <a:ext uri="{28A0092B-C50C-407E-A947-70E740481C1C}">
+                          <a14:useLocalDpi xmlns:a14="http://schemas.microsoft.com/office/drawing/2010/main" val="0"/>
+                        </a:ext>
+                      </a:extLst>
+                    </a:blip>
                     <a:stretch>
                       <a:fillRect/>
                     </a:stretch>
@@ -1457,9 +1463,163 @@
                 </pic:pic>
               </a:graphicData>
             </a:graphic>
-          </wp:inline>
+          </wp:anchor>
         </w:drawing>
       </w:r>
+    </w:p>
+    <w:p>
+      <w:pPr>
+        <w:jc w:val="both"/>
+        <w:rPr>
+          <w:b/>
+          <w:bCs/>
+          <w:sz w:val="28"/>
+          <w:szCs w:val="28"/>
+        </w:rPr>
+      </w:pPr>
+    </w:p>
+    <w:p>
+      <w:pPr>
+        <w:jc w:val="both"/>
+        <w:rPr>
+          <w:b/>
+          <w:bCs/>
+          <w:sz w:val="28"/>
+          <w:szCs w:val="28"/>
+        </w:rPr>
+      </w:pPr>
+    </w:p>
+    <w:p>
+      <w:pPr>
+        <w:jc w:val="both"/>
+        <w:rPr>
+          <w:b/>
+          <w:bCs/>
+          <w:sz w:val="28"/>
+          <w:szCs w:val="28"/>
+        </w:rPr>
+      </w:pPr>
+      <w:r>
+        <w:rPr>
+          <w:b/>
+          <w:bCs/>
+          <w:sz w:val="28"/>
+          <w:szCs w:val="28"/>
+        </w:rPr>
+        <w:lastRenderedPageBreak/>
+        <w:t>T</w:t>
+      </w:r>
+      <w:r>
+        <w:rPr>
+          <w:b/>
+          <w:bCs/>
+          <w:sz w:val="28"/>
+          <w:szCs w:val="28"/>
+        </w:rPr>
+        <w:t>ASK</w:t>
+      </w:r>
+      <w:r>
+        <w:rPr>
+          <w:b/>
+          <w:bCs/>
+          <w:sz w:val="28"/>
+          <w:szCs w:val="28"/>
+        </w:rPr>
+        <w:t xml:space="preserve"> 4</w:t>
+      </w:r>
+      <w:r>
+        <w:rPr>
+          <w:b/>
+          <w:bCs/>
+          <w:sz w:val="28"/>
+          <w:szCs w:val="28"/>
+        </w:rPr>
+        <w:t>:</w:t>
+      </w:r>
+      <w:r>
+        <w:rPr>
+          <w:b/>
+          <w:bCs/>
+          <w:sz w:val="28"/>
+          <w:szCs w:val="28"/>
+        </w:rPr>
+        <w:t xml:space="preserve"> Model-Based Collaborative Filtering (SVD)</w:t>
+      </w:r>
+    </w:p>
+    <w:p>
+      <w:pPr>
+        <w:jc w:val="both"/>
+        <w:rPr>
+          <w:sz w:val="24"/>
+          <w:szCs w:val="24"/>
+        </w:rPr>
+      </w:pPr>
+      <w:r>
+        <w:rPr>
+          <w:sz w:val="24"/>
+          <w:szCs w:val="24"/>
+        </w:rPr>
+        <w:t>In this task, a model-based collaborative filtering approach was implemented using Singular Value Decomposition (SVD). Unlike memory-based methods, SVD learns latent representations for users and items.</w:t>
+      </w:r>
+    </w:p>
+    <w:p>
+      <w:pPr>
+        <w:jc w:val="both"/>
+        <w:rPr>
+          <w:sz w:val="24"/>
+          <w:szCs w:val="24"/>
+        </w:rPr>
+      </w:pPr>
+      <w:r>
+        <w:rPr>
+          <w:sz w:val="24"/>
+          <w:szCs w:val="24"/>
+        </w:rPr>
+        <w:t>The model decomposes the user-item interaction matrix into lower-dimensional latent factors, capturing hidden relationships between users and movies. These latent factors represent implicit preferences and characteristics.</w:t>
+      </w:r>
+    </w:p>
+    <w:p>
+      <w:pPr>
+        <w:jc w:val="both"/>
+        <w:rPr>
+          <w:sz w:val="24"/>
+          <w:szCs w:val="24"/>
+        </w:rPr>
+      </w:pPr>
+      <w:r>
+        <w:rPr>
+          <w:sz w:val="24"/>
+          <w:szCs w:val="24"/>
+        </w:rPr>
+        <w:t>The predicted rating is computed using a combination of global average rating, user bias, item bias, and interaction between latent vectors.</w:t>
+      </w:r>
+    </w:p>
+    <w:p>
+      <w:pPr>
+        <w:jc w:val="both"/>
+        <w:rPr>
+          <w:sz w:val="24"/>
+          <w:szCs w:val="24"/>
+        </w:rPr>
+      </w:pPr>
+      <w:r>
+        <w:rPr>
+          <w:sz w:val="24"/>
+          <w:szCs w:val="24"/>
+        </w:rPr>
+        <w:t>The model was evaluated using RMSE and demonstrated improved accuracy compared to memory-based methods. This approach effectively handles sparsity and provides high-quality personalized recommendations.</w:t>
+      </w:r>
+    </w:p>
+    <w:p>
+      <w:pPr>
+        <w:jc w:val="both"/>
+        <w:rPr>
+          <w:b/>
+          <w:bCs/>
+          <w:sz w:val="28"/>
+          <w:szCs w:val="28"/>
+        </w:rPr>
+      </w:pPr>
     </w:p>
     <w:sectPr>
       <w:pgSz w:w="11906" w:h="16838"/>

</xml_diff>

<commit_message>
Redo Task 1 and Task 2
</commit_message>
<xml_diff>
--- a/M25DE1028_CSL7110_Assignment3.docx
+++ b/M25DE1028_CSL7110_Assignment3.docx
@@ -938,18 +938,46 @@
         <w:rPr>
           <w:b/>
           <w:bCs/>
-          <w:sz w:val="28"/>
-          <w:szCs w:val="28"/>
-        </w:rPr>
-      </w:pPr>
-      <w:r>
-        <w:rPr>
-          <w:b/>
-          <w:bCs/>
-          <w:sz w:val="28"/>
-          <w:szCs w:val="28"/>
+          <w:sz w:val="32"/>
+          <w:szCs w:val="32"/>
+        </w:rPr>
+      </w:pPr>
+      <w:r>
+        <w:rPr>
+          <w:b/>
+          <w:bCs/>
+          <w:sz w:val="32"/>
+          <w:szCs w:val="32"/>
         </w:rPr>
         <w:lastRenderedPageBreak/>
+        <w:t xml:space="preserve">Part 1: </w:t>
+      </w:r>
+      <w:r>
+        <w:rPr>
+          <w:b/>
+          <w:bCs/>
+          <w:sz w:val="32"/>
+          <w:szCs w:val="32"/>
+        </w:rPr>
+        <w:t>Content-Based Filtering</w:t>
+      </w:r>
+    </w:p>
+    <w:p>
+      <w:pPr>
+        <w:rPr>
+          <w:b/>
+          <w:bCs/>
+          <w:sz w:val="28"/>
+          <w:szCs w:val="28"/>
+        </w:rPr>
+      </w:pPr>
+      <w:r>
+        <w:rPr>
+          <w:b/>
+          <w:bCs/>
+          <w:sz w:val="28"/>
+          <w:szCs w:val="28"/>
+        </w:rPr>
         <w:t>TASK 1:</w:t>
       </w:r>
       <w:r>
@@ -959,8 +987,39 @@
           <w:sz w:val="28"/>
           <w:szCs w:val="28"/>
         </w:rPr>
-        <w:t xml:space="preserve"> TF-IDF Based Content Recommender</w:t>
-      </w:r>
+        <w:t xml:space="preserve"> </w:t>
+      </w:r>
+      <w:proofErr w:type="spellStart"/>
+      <w:r>
+        <w:rPr>
+          <w:b/>
+          <w:bCs/>
+          <w:sz w:val="28"/>
+          <w:szCs w:val="28"/>
+        </w:rPr>
+        <w:t>Precision@K</w:t>
+      </w:r>
+      <w:proofErr w:type="spellEnd"/>
+      <w:r>
+        <w:rPr>
+          <w:b/>
+          <w:bCs/>
+          <w:sz w:val="28"/>
+          <w:szCs w:val="28"/>
+        </w:rPr>
+        <w:t xml:space="preserve"> and </w:t>
+      </w:r>
+      <w:proofErr w:type="spellStart"/>
+      <w:r>
+        <w:rPr>
+          <w:b/>
+          <w:bCs/>
+          <w:sz w:val="28"/>
+          <w:szCs w:val="28"/>
+        </w:rPr>
+        <w:t>Recall@K</w:t>
+      </w:r>
+      <w:proofErr w:type="spellEnd"/>
     </w:p>
     <w:p>
       <w:pPr>
@@ -1007,23 +1066,7 @@
           <w:sz w:val="24"/>
           <w:szCs w:val="24"/>
         </w:rPr>
-        <w:t xml:space="preserve">A recommendation function was developed that takes a movie title as input and returns the </w:t>
-      </w:r>
-      <w:proofErr w:type="gramStart"/>
-      <w:r>
-        <w:rPr>
-          <w:sz w:val="24"/>
-          <w:szCs w:val="24"/>
-        </w:rPr>
-        <w:t>top-N</w:t>
-      </w:r>
-      <w:proofErr w:type="gramEnd"/>
-      <w:r>
-        <w:rPr>
-          <w:sz w:val="24"/>
-          <w:szCs w:val="24"/>
-        </w:rPr>
-        <w:t xml:space="preserve"> most similar movies along with their similarity scores.</w:t>
+        <w:t>A recommendation function was developed that takes a movie title as input and returns the top-N most similar movies along with their similarity scores.</w:t>
       </w:r>
     </w:p>
     <w:p>
@@ -1042,17 +1085,13 @@
         <w:t>The model successfully captures genre-based similarity and provides meaningful recommendations for movies sharing similar themes and categories.</w:t>
       </w:r>
     </w:p>
-    <w:p/>
-    <w:p>
-      <w:r>
-        <w:rPr>
-          <w:noProof/>
-        </w:rPr>
+    <w:p>
+      <w:r>
         <w:drawing>
-          <wp:inline distT="0" distB="0" distL="0" distR="0" wp14:anchorId="785FC849" wp14:editId="251215E8">
-            <wp:extent cx="5731510" cy="1090930"/>
+          <wp:inline distT="0" distB="0" distL="0" distR="0" wp14:anchorId="2C6EFA6D" wp14:editId="1C8B713B">
+            <wp:extent cx="5731510" cy="1908810"/>
             <wp:effectExtent l="0" t="0" r="2540" b="0"/>
-            <wp:docPr id="1817569288" name="Picture 1"/>
+            <wp:docPr id="1583223907" name="Picture 1"/>
             <wp:cNvGraphicFramePr>
               <a:graphicFrameLocks xmlns:a="http://schemas.openxmlformats.org/drawingml/2006/main" noChangeAspect="1"/>
             </wp:cNvGraphicFramePr>
@@ -1060,7 +1099,7 @@
               <a:graphicData uri="http://schemas.openxmlformats.org/drawingml/2006/picture">
                 <pic:pic xmlns:pic="http://schemas.openxmlformats.org/drawingml/2006/picture">
                   <pic:nvPicPr>
-                    <pic:cNvPr id="1817569288" name=""/>
+                    <pic:cNvPr id="1583223907" name=""/>
                     <pic:cNvPicPr/>
                   </pic:nvPicPr>
                   <pic:blipFill>
@@ -1072,7 +1111,7 @@
                   <pic:spPr>
                     <a:xfrm>
                       <a:off x="0" y="0"/>
-                      <a:ext cx="5731510" cy="1090930"/>
+                      <a:ext cx="5731510" cy="1908810"/>
                     </a:xfrm>
                     <a:prstGeom prst="rect">
                       <a:avLst/>
@@ -1085,178 +1124,13 @@
         </w:drawing>
       </w:r>
     </w:p>
-    <w:p/>
-    <w:p>
-      <w:pPr>
-        <w:rPr>
-          <w:b/>
-          <w:bCs/>
-          <w:sz w:val="28"/>
-          <w:szCs w:val="28"/>
-        </w:rPr>
-      </w:pPr>
-      <w:r>
-        <w:rPr>
-          <w:b/>
-          <w:bCs/>
-          <w:sz w:val="28"/>
-          <w:szCs w:val="28"/>
-        </w:rPr>
-        <w:t>T</w:t>
-      </w:r>
-      <w:r>
-        <w:rPr>
-          <w:b/>
-          <w:bCs/>
-          <w:sz w:val="28"/>
-          <w:szCs w:val="28"/>
-        </w:rPr>
-        <w:t>ASK</w:t>
-      </w:r>
-      <w:r>
-        <w:rPr>
-          <w:b/>
-          <w:bCs/>
-          <w:sz w:val="28"/>
-          <w:szCs w:val="28"/>
-        </w:rPr>
-        <w:t xml:space="preserve"> 2</w:t>
-      </w:r>
-      <w:r>
-        <w:rPr>
-          <w:b/>
-          <w:bCs/>
-          <w:sz w:val="28"/>
-          <w:szCs w:val="28"/>
-        </w:rPr>
-        <w:t xml:space="preserve">: </w:t>
-      </w:r>
-      <w:r>
-        <w:rPr>
-          <w:b/>
-          <w:bCs/>
-          <w:sz w:val="28"/>
-          <w:szCs w:val="28"/>
-        </w:rPr>
-        <w:t>User Profile Based Recommender</w:t>
-      </w:r>
-    </w:p>
-    <w:p>
-      <w:pPr>
-        <w:jc w:val="both"/>
-        <w:rPr>
-          <w:sz w:val="24"/>
-          <w:szCs w:val="24"/>
-        </w:rPr>
-      </w:pPr>
-      <w:r>
-        <w:rPr>
-          <w:sz w:val="24"/>
-          <w:szCs w:val="24"/>
-        </w:rPr>
-        <w:t>In this task, a personalized content-based recommender system was developed by constructing user profiles from historical ratings. Each user profile was computed as a weighted average of TF-IDF vectors of movies rated by the user.</w:t>
-      </w:r>
-    </w:p>
-    <w:p>
-      <w:pPr>
-        <w:jc w:val="both"/>
-        <w:rPr>
-          <w:sz w:val="24"/>
-          <w:szCs w:val="24"/>
-        </w:rPr>
-      </w:pPr>
-      <w:r>
-        <w:rPr>
-          <w:sz w:val="24"/>
-          <w:szCs w:val="24"/>
-        </w:rPr>
-        <w:t>The weights correspond to the ratings given by the user, ensuring that highly rated movies contribute more to the profile. The user profile vector captures the overall preferences of the user in terms of genres.</w:t>
-      </w:r>
-    </w:p>
-    <w:p>
-      <w:pPr>
-        <w:jc w:val="both"/>
-        <w:rPr>
-          <w:sz w:val="24"/>
-          <w:szCs w:val="24"/>
-        </w:rPr>
-      </w:pPr>
-      <w:r>
-        <w:rPr>
-          <w:sz w:val="24"/>
-          <w:szCs w:val="24"/>
-        </w:rPr>
-        <w:t xml:space="preserve">Cosine similarity was then computed between the user profile and all movie vectors to generate recommendations. Movies were ranked based on similarity scores and the </w:t>
-      </w:r>
-      <w:proofErr w:type="gramStart"/>
-      <w:r>
-        <w:rPr>
-          <w:sz w:val="24"/>
-          <w:szCs w:val="24"/>
-        </w:rPr>
-        <w:t>top-N</w:t>
-      </w:r>
-      <w:proofErr w:type="gramEnd"/>
-      <w:r>
-        <w:rPr>
-          <w:sz w:val="24"/>
-          <w:szCs w:val="24"/>
-        </w:rPr>
-        <w:t xml:space="preserve"> recommendations were returned.</w:t>
-      </w:r>
-    </w:p>
-    <w:p>
-      <w:pPr>
-        <w:jc w:val="both"/>
-        <w:rPr>
-          <w:sz w:val="24"/>
-          <w:szCs w:val="24"/>
-        </w:rPr>
-      </w:pPr>
-      <w:r>
-        <w:rPr>
-          <w:sz w:val="24"/>
-          <w:szCs w:val="24"/>
-        </w:rPr>
-        <w:t>This approach introduces personalization into the recommendation process and performs better than basic content-based filtering.</w:t>
-      </w:r>
-    </w:p>
-    <w:p>
-      <w:pPr>
-        <w:jc w:val="both"/>
-        <w:rPr>
-          <w:sz w:val="24"/>
-          <w:szCs w:val="24"/>
-        </w:rPr>
-      </w:pPr>
-    </w:p>
-    <w:p>
-      <w:pPr>
-        <w:jc w:val="both"/>
-        <w:rPr>
-          <w:sz w:val="24"/>
-          <w:szCs w:val="24"/>
-        </w:rPr>
-      </w:pPr>
-      <w:r>
-        <w:rPr>
-          <w:noProof/>
-          <w:sz w:val="24"/>
-          <w:szCs w:val="24"/>
-        </w:rPr>
+    <w:p>
+      <w:r>
         <w:drawing>
-          <wp:anchor distT="0" distB="0" distL="114300" distR="114300" simplePos="0" relativeHeight="251662336" behindDoc="0" locked="0" layoutInCell="1" allowOverlap="1" wp14:anchorId="4E1FA613" wp14:editId="0B3AA934">
-            <wp:simplePos x="0" y="0"/>
-            <wp:positionH relativeFrom="margin">
-              <wp:align>right</wp:align>
-            </wp:positionH>
-            <wp:positionV relativeFrom="paragraph">
-              <wp:posOffset>9525</wp:posOffset>
-            </wp:positionV>
-            <wp:extent cx="5731510" cy="1470025"/>
-            <wp:effectExtent l="0" t="0" r="2540" b="0"/>
-            <wp:wrapNone/>
-            <wp:docPr id="782300615" name="Picture 1"/>
+          <wp:inline distT="0" distB="0" distL="0" distR="0" wp14:anchorId="20305404" wp14:editId="427D90BD">
+            <wp:extent cx="5731510" cy="323215"/>
+            <wp:effectExtent l="0" t="0" r="2540" b="635"/>
+            <wp:docPr id="511464681" name="Picture 1"/>
             <wp:cNvGraphicFramePr>
               <a:graphicFrameLocks xmlns:a="http://schemas.openxmlformats.org/drawingml/2006/main" noChangeAspect="1"/>
             </wp:cNvGraphicFramePr>
@@ -1264,17 +1138,11 @@
               <a:graphicData uri="http://schemas.openxmlformats.org/drawingml/2006/picture">
                 <pic:pic xmlns:pic="http://schemas.openxmlformats.org/drawingml/2006/picture">
                   <pic:nvPicPr>
-                    <pic:cNvPr id="782300615" name=""/>
+                    <pic:cNvPr id="511464681" name=""/>
                     <pic:cNvPicPr/>
                   </pic:nvPicPr>
                   <pic:blipFill>
-                    <a:blip r:embed="rId13">
-                      <a:extLst>
-                        <a:ext uri="{28A0092B-C50C-407E-A947-70E740481C1C}">
-                          <a14:useLocalDpi xmlns:a14="http://schemas.microsoft.com/office/drawing/2010/main" val="0"/>
-                        </a:ext>
-                      </a:extLst>
-                    </a:blip>
+                    <a:blip r:embed="rId13"/>
                     <a:stretch>
                       <a:fillRect/>
                     </a:stretch>
@@ -1282,7 +1150,7 @@
                   <pic:spPr>
                     <a:xfrm>
                       <a:off x="0" y="0"/>
-                      <a:ext cx="5731510" cy="1470025"/>
+                      <a:ext cx="5731510" cy="323215"/>
                     </a:xfrm>
                     <a:prstGeom prst="rect">
                       <a:avLst/>
@@ -1291,31 +1159,94 @@
                 </pic:pic>
               </a:graphicData>
             </a:graphic>
-          </wp:anchor>
+          </wp:inline>
         </w:drawing>
       </w:r>
     </w:p>
-    <w:p>
-      <w:pPr>
-        <w:jc w:val="both"/>
-        <w:rPr>
-          <w:sz w:val="24"/>
-          <w:szCs w:val="24"/>
-        </w:rPr>
-      </w:pPr>
-    </w:p>
-    <w:p>
-      <w:pPr>
-        <w:jc w:val="both"/>
-        <w:rPr>
-          <w:sz w:val="24"/>
-          <w:szCs w:val="24"/>
-        </w:rPr>
-      </w:pPr>
-    </w:p>
-    <w:p>
-      <w:pPr>
-        <w:jc w:val="both"/>
+    <w:p/>
+    <w:p/>
+    <w:p>
+      <w:pPr>
+        <w:rPr>
+          <w:b/>
+          <w:bCs/>
+          <w:sz w:val="28"/>
+          <w:szCs w:val="28"/>
+        </w:rPr>
+      </w:pPr>
+    </w:p>
+    <w:p>
+      <w:pPr>
+        <w:rPr>
+          <w:b/>
+          <w:bCs/>
+          <w:sz w:val="28"/>
+          <w:szCs w:val="28"/>
+        </w:rPr>
+      </w:pPr>
+    </w:p>
+    <w:p>
+      <w:pPr>
+        <w:rPr>
+          <w:b/>
+          <w:bCs/>
+          <w:sz w:val="28"/>
+          <w:szCs w:val="28"/>
+        </w:rPr>
+      </w:pPr>
+    </w:p>
+    <w:p>
+      <w:pPr>
+        <w:rPr>
+          <w:b/>
+          <w:bCs/>
+          <w:sz w:val="28"/>
+          <w:szCs w:val="28"/>
+        </w:rPr>
+      </w:pPr>
+    </w:p>
+    <w:p>
+      <w:pPr>
+        <w:rPr>
+          <w:b/>
+          <w:bCs/>
+          <w:sz w:val="28"/>
+          <w:szCs w:val="28"/>
+        </w:rPr>
+      </w:pPr>
+    </w:p>
+    <w:p>
+      <w:pPr>
+        <w:rPr>
+          <w:b/>
+          <w:bCs/>
+          <w:sz w:val="28"/>
+          <w:szCs w:val="28"/>
+        </w:rPr>
+      </w:pPr>
+    </w:p>
+    <w:p>
+      <w:pPr>
+        <w:rPr>
+          <w:b/>
+          <w:bCs/>
+          <w:sz w:val="28"/>
+          <w:szCs w:val="28"/>
+        </w:rPr>
+      </w:pPr>
+    </w:p>
+    <w:p>
+      <w:pPr>
+        <w:rPr>
+          <w:b/>
+          <w:bCs/>
+          <w:sz w:val="28"/>
+          <w:szCs w:val="28"/>
+        </w:rPr>
+      </w:pPr>
+    </w:p>
+    <w:p>
+      <w:pPr>
         <w:rPr>
           <w:b/>
           <w:bCs/>
@@ -1349,6 +1280,609 @@
           <w:sz w:val="28"/>
           <w:szCs w:val="28"/>
         </w:rPr>
+        <w:t xml:space="preserve"> 2</w:t>
+      </w:r>
+      <w:r>
+        <w:rPr>
+          <w:b/>
+          <w:bCs/>
+          <w:sz w:val="28"/>
+          <w:szCs w:val="28"/>
+        </w:rPr>
+        <w:t xml:space="preserve">: </w:t>
+      </w:r>
+      <w:r>
+        <w:rPr>
+          <w:b/>
+          <w:bCs/>
+          <w:sz w:val="28"/>
+          <w:szCs w:val="28"/>
+        </w:rPr>
+        <w:t>User Profile Based Recommender</w:t>
+      </w:r>
+    </w:p>
+    <w:p>
+      <w:pPr>
+        <w:jc w:val="both"/>
+        <w:rPr>
+          <w:sz w:val="24"/>
+          <w:szCs w:val="24"/>
+        </w:rPr>
+      </w:pPr>
+      <w:r>
+        <w:rPr>
+          <w:sz w:val="24"/>
+          <w:szCs w:val="24"/>
+        </w:rPr>
+        <w:t>Task 2 extends content-based filtering by building personalised user profiles from each user's rating history. Rather than finding movies similar to a single item, the system learns what genres a user prefers and ranks all unseen movies against that preference vector.</w:t>
+      </w:r>
+    </w:p>
+    <w:p>
+      <w:pPr>
+        <w:jc w:val="both"/>
+        <w:rPr>
+          <w:sz w:val="24"/>
+          <w:szCs w:val="24"/>
+        </w:rPr>
+      </w:pPr>
+      <w:r>
+        <w:rPr>
+          <w:b/>
+          <w:bCs/>
+          <w:sz w:val="24"/>
+          <w:szCs w:val="24"/>
+        </w:rPr>
+        <w:t>Implementation</w:t>
+      </w:r>
+    </w:p>
+    <w:p>
+      <w:pPr>
+        <w:jc w:val="both"/>
+        <w:rPr>
+          <w:sz w:val="24"/>
+          <w:szCs w:val="24"/>
+        </w:rPr>
+      </w:pPr>
+      <w:r>
+        <w:rPr>
+          <w:sz w:val="24"/>
+          <w:szCs w:val="24"/>
+        </w:rPr>
+        <w:t xml:space="preserve">For each user, a profile vector </w:t>
+      </w:r>
+      <m:oMath>
+        <m:sSub>
+          <m:sSubPr>
+            <m:ctrlPr>
+              <w:rPr>
+                <w:rFonts w:ascii="Cambria Math" w:hAnsi="Cambria Math"/>
+                <w:sz w:val="24"/>
+                <w:szCs w:val="24"/>
+              </w:rPr>
+            </m:ctrlPr>
+          </m:sSubPr>
+          <m:e>
+            <m:r>
+              <w:rPr>
+                <w:rFonts w:ascii="Cambria Math" w:hAnsi="Cambria Math"/>
+                <w:sz w:val="24"/>
+                <w:szCs w:val="24"/>
+              </w:rPr>
+              <m:t>P</m:t>
+            </m:r>
+          </m:e>
+          <m:sub>
+            <m:r>
+              <w:rPr>
+                <w:rFonts w:ascii="Cambria Math" w:hAnsi="Cambria Math"/>
+                <w:sz w:val="24"/>
+                <w:szCs w:val="24"/>
+              </w:rPr>
+              <m:t>u</m:t>
+            </m:r>
+          </m:sub>
+        </m:sSub>
+      </m:oMath>
+      <w:r>
+        <w:rPr>
+          <w:sz w:val="24"/>
+          <w:szCs w:val="24"/>
+        </w:rPr>
+        <w:t xml:space="preserve">was constructed as a weighted average of the TF-IDF vectors of movies they had rated, with weights proportional to the ratings given: </w:t>
+      </w:r>
+    </w:p>
+    <w:p>
+      <w:pPr>
+        <w:jc w:val="both"/>
+        <w:rPr>
+          <w:sz w:val="24"/>
+          <w:szCs w:val="24"/>
+        </w:rPr>
+      </w:pPr>
+      <m:oMathPara>
+        <m:oMath>
+          <m:sSub>
+            <m:sSubPr>
+              <m:ctrlPr>
+                <w:rPr>
+                  <w:rFonts w:ascii="Cambria Math" w:hAnsi="Cambria Math"/>
+                  <w:sz w:val="24"/>
+                  <w:szCs w:val="24"/>
+                </w:rPr>
+              </m:ctrlPr>
+            </m:sSubPr>
+            <m:e>
+              <m:r>
+                <w:rPr>
+                  <w:rFonts w:ascii="Cambria Math" w:hAnsi="Cambria Math"/>
+                  <w:sz w:val="24"/>
+                  <w:szCs w:val="24"/>
+                </w:rPr>
+                <m:t>P</m:t>
+              </m:r>
+            </m:e>
+            <m:sub>
+              <m:r>
+                <w:rPr>
+                  <w:rFonts w:ascii="Cambria Math" w:hAnsi="Cambria Math"/>
+                  <w:sz w:val="24"/>
+                  <w:szCs w:val="24"/>
+                </w:rPr>
+                <m:t>u</m:t>
+              </m:r>
+            </m:sub>
+          </m:sSub>
+          <m:r>
+            <w:rPr>
+              <w:rFonts w:ascii="Cambria Math" w:hAnsi="Cambria Math"/>
+              <w:sz w:val="24"/>
+              <w:szCs w:val="24"/>
+            </w:rPr>
+            <m:t>=</m:t>
+          </m:r>
+          <m:f>
+            <m:fPr>
+              <m:ctrlPr>
+                <w:rPr>
+                  <w:rFonts w:ascii="Cambria Math" w:hAnsi="Cambria Math"/>
+                  <w:sz w:val="24"/>
+                  <w:szCs w:val="24"/>
+                </w:rPr>
+              </m:ctrlPr>
+            </m:fPr>
+            <m:num>
+              <m:nary>
+                <m:naryPr>
+                  <m:chr m:val="∑"/>
+                  <m:limLoc m:val="undOvr"/>
+                  <m:grow m:val="1"/>
+                  <m:supHide m:val="1"/>
+                  <m:ctrlPr>
+                    <w:rPr>
+                      <w:rFonts w:ascii="Cambria Math" w:hAnsi="Cambria Math"/>
+                      <w:sz w:val="24"/>
+                      <w:szCs w:val="24"/>
+                    </w:rPr>
+                  </m:ctrlPr>
+                </m:naryPr>
+                <m:sub>
+                  <m:r>
+                    <w:rPr>
+                      <w:rFonts w:ascii="Cambria Math" w:hAnsi="Cambria Math"/>
+                      <w:sz w:val="24"/>
+                      <w:szCs w:val="24"/>
+                    </w:rPr>
+                    <m:t>m</m:t>
+                  </m:r>
+                </m:sub>
+                <m:sup/>
+                <m:e>
+                  <m:sSub>
+                    <m:sSubPr>
+                      <m:ctrlPr>
+                        <w:rPr>
+                          <w:rFonts w:ascii="Cambria Math" w:hAnsi="Cambria Math"/>
+                          <w:sz w:val="24"/>
+                          <w:szCs w:val="24"/>
+                        </w:rPr>
+                      </m:ctrlPr>
+                    </m:sSubPr>
+                    <m:e>
+                      <m:r>
+                        <w:rPr>
+                          <w:rFonts w:ascii="Cambria Math" w:hAnsi="Cambria Math"/>
+                          <w:sz w:val="24"/>
+                          <w:szCs w:val="24"/>
+                        </w:rPr>
+                        <m:t>r</m:t>
+                      </m:r>
+                    </m:e>
+                    <m:sub>
+                      <m:r>
+                        <w:rPr>
+                          <w:rFonts w:ascii="Cambria Math" w:hAnsi="Cambria Math"/>
+                          <w:sz w:val="24"/>
+                          <w:szCs w:val="24"/>
+                        </w:rPr>
+                        <m:t>u,m</m:t>
+                      </m:r>
+                    </m:sub>
+                  </m:sSub>
+                </m:e>
+              </m:nary>
+              <m:r>
+                <w:rPr>
+                  <w:rFonts w:ascii="Cambria Math" w:hAnsi="Cambria Math"/>
+                  <w:sz w:val="24"/>
+                  <w:szCs w:val="24"/>
+                </w:rPr>
+                <m:t>⋅</m:t>
+              </m:r>
+              <m:sSub>
+                <m:sSubPr>
+                  <m:ctrlPr>
+                    <w:rPr>
+                      <w:rFonts w:ascii="Cambria Math" w:hAnsi="Cambria Math"/>
+                      <w:sz w:val="24"/>
+                      <w:szCs w:val="24"/>
+                    </w:rPr>
+                  </m:ctrlPr>
+                </m:sSubPr>
+                <m:e>
+                  <m:r>
+                    <w:rPr>
+                      <w:rFonts w:ascii="Cambria Math" w:hAnsi="Cambria Math"/>
+                      <w:sz w:val="24"/>
+                      <w:szCs w:val="24"/>
+                    </w:rPr>
+                    <m:t>f</m:t>
+                  </m:r>
+                </m:e>
+                <m:sub>
+                  <m:r>
+                    <w:rPr>
+                      <w:rFonts w:ascii="Cambria Math" w:hAnsi="Cambria Math"/>
+                      <w:sz w:val="24"/>
+                      <w:szCs w:val="24"/>
+                    </w:rPr>
+                    <m:t>m</m:t>
+                  </m:r>
+                </m:sub>
+              </m:sSub>
+            </m:num>
+            <m:den>
+              <m:nary>
+                <m:naryPr>
+                  <m:chr m:val="∑"/>
+                  <m:limLoc m:val="undOvr"/>
+                  <m:grow m:val="1"/>
+                  <m:supHide m:val="1"/>
+                  <m:ctrlPr>
+                    <w:rPr>
+                      <w:rFonts w:ascii="Cambria Math" w:hAnsi="Cambria Math"/>
+                      <w:sz w:val="24"/>
+                      <w:szCs w:val="24"/>
+                    </w:rPr>
+                  </m:ctrlPr>
+                </m:naryPr>
+                <m:sub>
+                  <m:r>
+                    <w:rPr>
+                      <w:rFonts w:ascii="Cambria Math" w:hAnsi="Cambria Math"/>
+                      <w:sz w:val="24"/>
+                      <w:szCs w:val="24"/>
+                    </w:rPr>
+                    <m:t>m</m:t>
+                  </m:r>
+                </m:sub>
+                <m:sup/>
+                <m:e>
+                  <m:sSub>
+                    <m:sSubPr>
+                      <m:ctrlPr>
+                        <w:rPr>
+                          <w:rFonts w:ascii="Cambria Math" w:hAnsi="Cambria Math"/>
+                          <w:sz w:val="24"/>
+                          <w:szCs w:val="24"/>
+                        </w:rPr>
+                      </m:ctrlPr>
+                    </m:sSubPr>
+                    <m:e>
+                      <m:r>
+                        <w:rPr>
+                          <w:rFonts w:ascii="Cambria Math" w:hAnsi="Cambria Math"/>
+                          <w:sz w:val="24"/>
+                          <w:szCs w:val="24"/>
+                        </w:rPr>
+                        <m:t>r</m:t>
+                      </m:r>
+                    </m:e>
+                    <m:sub>
+                      <m:r>
+                        <w:rPr>
+                          <w:rFonts w:ascii="Cambria Math" w:hAnsi="Cambria Math"/>
+                          <w:sz w:val="24"/>
+                          <w:szCs w:val="24"/>
+                        </w:rPr>
+                        <m:t>u,m</m:t>
+                      </m:r>
+                    </m:sub>
+                  </m:sSub>
+                </m:e>
+              </m:nary>
+            </m:den>
+          </m:f>
+        </m:oMath>
+      </m:oMathPara>
+    </w:p>
+    <w:p>
+      <w:pPr>
+        <w:jc w:val="both"/>
+        <w:rPr>
+          <w:sz w:val="24"/>
+          <w:szCs w:val="24"/>
+        </w:rPr>
+      </w:pPr>
+      <w:r>
+        <w:rPr>
+          <w:sz w:val="24"/>
+          <w:szCs w:val="24"/>
+        </w:rPr>
+        <w:t>This ensures highly-rated movies contribute more to the profile than poorly-rated ones. Recommendations were then generated by computing cosine similarity between the user profile and all movie vectors, filtering out already-rated movies, and returning the top-N highest-scoring unseen movies.</w:t>
+      </w:r>
+    </w:p>
+    <w:p>
+      <w:pPr>
+        <w:jc w:val="both"/>
+        <w:rPr>
+          <w:sz w:val="24"/>
+          <w:szCs w:val="24"/>
+        </w:rPr>
+      </w:pPr>
+      <w:r>
+        <w:rPr>
+          <w:b/>
+          <w:bCs/>
+          <w:sz w:val="24"/>
+          <w:szCs w:val="24"/>
+        </w:rPr>
+        <w:t>Evaluation</w:t>
+      </w:r>
+    </w:p>
+    <w:p>
+      <w:pPr>
+        <w:jc w:val="both"/>
+        <w:rPr>
+          <w:sz w:val="24"/>
+          <w:szCs w:val="24"/>
+        </w:rPr>
+      </w:pPr>
+      <w:r>
+        <w:rPr>
+          <w:sz w:val="24"/>
+          <w:szCs w:val="24"/>
+        </w:rPr>
+        <w:t>To evaluate, each user's highly-rated movies (rating ≥ 4.0) were split 80/20 into training and test sets. The profile was built from the training portion only, and the top-K recommended movies were checked against the held-out test set.</w:t>
+      </w:r>
+    </w:p>
+    <w:p>
+      <w:pPr>
+        <w:jc w:val="both"/>
+        <w:rPr>
+          <w:sz w:val="24"/>
+          <w:szCs w:val="24"/>
+        </w:rPr>
+      </w:pPr>
+      <w:r>
+        <w:rPr>
+          <w:sz w:val="24"/>
+          <w:szCs w:val="24"/>
+        </w:rPr>
+        <w:drawing>
+          <wp:inline distT="0" distB="0" distL="0" distR="0" wp14:anchorId="73BFD5C5" wp14:editId="2FB3367C">
+            <wp:extent cx="5731510" cy="429895"/>
+            <wp:effectExtent l="0" t="0" r="2540" b="8255"/>
+            <wp:docPr id="523469456" name="Picture 1"/>
+            <wp:cNvGraphicFramePr>
+              <a:graphicFrameLocks xmlns:a="http://schemas.openxmlformats.org/drawingml/2006/main" noChangeAspect="1"/>
+            </wp:cNvGraphicFramePr>
+            <a:graphic xmlns:a="http://schemas.openxmlformats.org/drawingml/2006/main">
+              <a:graphicData uri="http://schemas.openxmlformats.org/drawingml/2006/picture">
+                <pic:pic xmlns:pic="http://schemas.openxmlformats.org/drawingml/2006/picture">
+                  <pic:nvPicPr>
+                    <pic:cNvPr id="523469456" name=""/>
+                    <pic:cNvPicPr/>
+                  </pic:nvPicPr>
+                  <pic:blipFill>
+                    <a:blip r:embed="rId14"/>
+                    <a:stretch>
+                      <a:fillRect/>
+                    </a:stretch>
+                  </pic:blipFill>
+                  <pic:spPr>
+                    <a:xfrm>
+                      <a:off x="0" y="0"/>
+                      <a:ext cx="5731510" cy="429895"/>
+                    </a:xfrm>
+                    <a:prstGeom prst="rect">
+                      <a:avLst/>
+                    </a:prstGeom>
+                  </pic:spPr>
+                </pic:pic>
+              </a:graphicData>
+            </a:graphic>
+          </wp:inline>
+        </w:drawing>
+      </w:r>
+    </w:p>
+    <w:p>
+      <w:pPr>
+        <w:jc w:val="both"/>
+        <w:rPr>
+          <w:sz w:val="24"/>
+          <w:szCs w:val="24"/>
+        </w:rPr>
+      </w:pPr>
+      <w:r>
+        <w:rPr>
+          <w:sz w:val="24"/>
+          <w:szCs w:val="24"/>
+        </w:rPr>
+        <w:drawing>
+          <wp:inline distT="0" distB="0" distL="0" distR="0" wp14:anchorId="41C6C238" wp14:editId="21BEF193">
+            <wp:extent cx="4778734" cy="2359189"/>
+            <wp:effectExtent l="0" t="0" r="3175" b="3175"/>
+            <wp:docPr id="1867765850" name="Picture 1"/>
+            <wp:cNvGraphicFramePr>
+              <a:graphicFrameLocks xmlns:a="http://schemas.openxmlformats.org/drawingml/2006/main" noChangeAspect="1"/>
+            </wp:cNvGraphicFramePr>
+            <a:graphic xmlns:a="http://schemas.openxmlformats.org/drawingml/2006/main">
+              <a:graphicData uri="http://schemas.openxmlformats.org/drawingml/2006/picture">
+                <pic:pic xmlns:pic="http://schemas.openxmlformats.org/drawingml/2006/picture">
+                  <pic:nvPicPr>
+                    <pic:cNvPr id="1867765850" name=""/>
+                    <pic:cNvPicPr/>
+                  </pic:nvPicPr>
+                  <pic:blipFill>
+                    <a:blip r:embed="rId15"/>
+                    <a:stretch>
+                      <a:fillRect/>
+                    </a:stretch>
+                  </pic:blipFill>
+                  <pic:spPr>
+                    <a:xfrm>
+                      <a:off x="0" y="0"/>
+                      <a:ext cx="4799436" cy="2369409"/>
+                    </a:xfrm>
+                    <a:prstGeom prst="rect">
+                      <a:avLst/>
+                    </a:prstGeom>
+                  </pic:spPr>
+                </pic:pic>
+              </a:graphicData>
+            </a:graphic>
+          </wp:inline>
+        </w:drawing>
+      </w:r>
+    </w:p>
+    <w:p>
+      <w:pPr>
+        <w:jc w:val="both"/>
+        <w:rPr>
+          <w:sz w:val="24"/>
+          <w:szCs w:val="24"/>
+        </w:rPr>
+      </w:pPr>
+      <w:r>
+        <w:rPr>
+          <w:b/>
+          <w:bCs/>
+          <w:sz w:val="24"/>
+          <w:szCs w:val="24"/>
+        </w:rPr>
+        <w:t>Analysis</w:t>
+      </w:r>
+    </w:p>
+    <w:p>
+      <w:pPr>
+        <w:jc w:val="both"/>
+        <w:rPr>
+          <w:sz w:val="24"/>
+          <w:szCs w:val="24"/>
+        </w:rPr>
+      </w:pPr>
+      <w:r>
+        <w:rPr>
+          <w:sz w:val="24"/>
+          <w:szCs w:val="24"/>
+        </w:rPr>
+        <w:t xml:space="preserve">As K increases, </w:t>
+      </w:r>
+      <w:proofErr w:type="spellStart"/>
+      <w:r>
+        <w:rPr>
+          <w:sz w:val="24"/>
+          <w:szCs w:val="24"/>
+        </w:rPr>
+        <w:t>Recall@K</w:t>
+      </w:r>
+      <w:proofErr w:type="spellEnd"/>
+      <w:r>
+        <w:rPr>
+          <w:sz w:val="24"/>
+          <w:szCs w:val="24"/>
+        </w:rPr>
+        <w:t xml:space="preserve"> improves since more movies are recommended, increasing the chance of hitting relevant items. </w:t>
+      </w:r>
+      <w:proofErr w:type="spellStart"/>
+      <w:r>
+        <w:rPr>
+          <w:sz w:val="24"/>
+          <w:szCs w:val="24"/>
+        </w:rPr>
+        <w:t>Precision@K</w:t>
+      </w:r>
+      <w:proofErr w:type="spellEnd"/>
+      <w:r>
+        <w:rPr>
+          <w:sz w:val="24"/>
+          <w:szCs w:val="24"/>
+        </w:rPr>
+        <w:t xml:space="preserve"> decreases with larger K as the proportion of truly relevant movies in the recommendation list drops — the classic precision-recall </w:t>
+      </w:r>
+      <w:proofErr w:type="spellStart"/>
+      <w:r>
+        <w:rPr>
+          <w:sz w:val="24"/>
+          <w:szCs w:val="24"/>
+        </w:rPr>
+        <w:t>tradeoff</w:t>
+      </w:r>
+      <w:proofErr w:type="spellEnd"/>
+      <w:r>
+        <w:rPr>
+          <w:sz w:val="24"/>
+          <w:szCs w:val="24"/>
+        </w:rPr>
+        <w:t>. The user-profile approach personalises recommendations more effectively than item-item TF-IDF alone, since it aggregates preferences across the user's entire watch history.</w:t>
+      </w:r>
+    </w:p>
+    <w:p>
+      <w:pPr>
+        <w:jc w:val="both"/>
+        <w:rPr>
+          <w:b/>
+          <w:bCs/>
+          <w:sz w:val="28"/>
+          <w:szCs w:val="28"/>
+        </w:rPr>
+      </w:pPr>
+      <w:r>
+        <w:rPr>
+          <w:b/>
+          <w:bCs/>
+          <w:sz w:val="28"/>
+          <w:szCs w:val="28"/>
+        </w:rPr>
+        <w:lastRenderedPageBreak/>
+        <w:t>T</w:t>
+      </w:r>
+      <w:r>
+        <w:rPr>
+          <w:b/>
+          <w:bCs/>
+          <w:sz w:val="28"/>
+          <w:szCs w:val="28"/>
+        </w:rPr>
+        <w:t>ASK</w:t>
+      </w:r>
+      <w:r>
+        <w:rPr>
+          <w:b/>
+          <w:bCs/>
+          <w:sz w:val="28"/>
+          <w:szCs w:val="28"/>
+        </w:rPr>
         <w:t xml:space="preserve"> 3</w:t>
       </w:r>
       <w:r>
@@ -1445,23 +1979,7 @@
           <w:sz w:val="24"/>
           <w:szCs w:val="24"/>
         </w:rPr>
-        <w:t xml:space="preserve">Based on predicted ratings, </w:t>
-      </w:r>
-      <w:proofErr w:type="gramStart"/>
-      <w:r>
-        <w:rPr>
-          <w:sz w:val="24"/>
-          <w:szCs w:val="24"/>
-        </w:rPr>
-        <w:t>top-N</w:t>
-      </w:r>
-      <w:proofErr w:type="gramEnd"/>
-      <w:r>
-        <w:rPr>
-          <w:sz w:val="24"/>
-          <w:szCs w:val="24"/>
-        </w:rPr>
-        <w:t xml:space="preserve"> recommendations were generated for each user. This approach captures collaborative </w:t>
+        <w:t xml:space="preserve">Based on predicted ratings, top-N recommendations were generated for each user. This approach captures collaborative </w:t>
       </w:r>
       <w:r>
         <w:rPr>
@@ -1520,7 +2038,7 @@
                     <pic:cNvPicPr/>
                   </pic:nvPicPr>
                   <pic:blipFill>
-                    <a:blip r:embed="rId14">
+                    <a:blip r:embed="rId16">
                       <a:extLst>
                         <a:ext uri="{28A0092B-C50C-407E-A947-70E740481C1C}">
                           <a14:useLocalDpi xmlns:a14="http://schemas.microsoft.com/office/drawing/2010/main" val="0"/>
@@ -1745,7 +2263,7 @@
                     <pic:cNvPicPr/>
                   </pic:nvPicPr>
                   <pic:blipFill>
-                    <a:blip r:embed="rId15"/>
+                    <a:blip r:embed="rId17"/>
                     <a:stretch>
                       <a:fillRect/>
                     </a:stretch>
@@ -2786,7 +3304,6 @@
   <w:style w:type="character" w:default="1" w:styleId="DefaultParagraphFont">
     <w:name w:val="Default Paragraph Font"/>
     <w:uiPriority w:val="1"/>
-    <w:semiHidden/>
     <w:unhideWhenUsed/>
   </w:style>
   <w:style w:type="table" w:default="1" w:styleId="TableNormal">

</xml_diff>

<commit_message>
Final Update on the Report
</commit_message>
<xml_diff>
--- a/M25DE1028_CSL7110_Assignment3.docx
+++ b/M25DE1028_CSL7110_Assignment3.docx
@@ -8047,201 +8047,787 @@
           <w:sz w:val="24"/>
           <w:szCs w:val="24"/>
         </w:rPr>
-        <w:t xml:space="preserve">In this assignment, different recommender system techniques were implemented and compared using the </w:t>
-      </w:r>
-      <w:proofErr w:type="spellStart"/>
-      <w:r>
-        <w:rPr>
-          <w:sz w:val="24"/>
-          <w:szCs w:val="24"/>
-        </w:rPr>
-        <w:t>MovieLens</w:t>
-      </w:r>
-      <w:proofErr w:type="spellEnd"/>
-      <w:r>
-        <w:rPr>
-          <w:sz w:val="24"/>
-          <w:szCs w:val="24"/>
-        </w:rPr>
-        <w:t xml:space="preserve"> dataset. First, content-based filtering was performed using TF-IDF on movie genres, which helped in finding movies with similar characteristics. Then, a user-profile-based recommender was created to make the recommendations more personalized based on the movies rated by a user. After that, collaborative filtering methods were applied, where recommendations were generated using similarities between users </w:t>
-      </w:r>
-      <w:r>
-        <w:rPr>
-          <w:sz w:val="24"/>
-          <w:szCs w:val="24"/>
-        </w:rPr>
-        <w:t>and</w:t>
-      </w:r>
-      <w:r>
-        <w:rPr>
-          <w:sz w:val="24"/>
-          <w:szCs w:val="24"/>
-        </w:rPr>
-        <w:t xml:space="preserve"> with the help of SVD, which is a model-based approach.</w:t>
-      </w:r>
-    </w:p>
-    <w:p>
-      <w:pPr>
-        <w:jc w:val="both"/>
-        <w:rPr>
-          <w:sz w:val="24"/>
-          <w:szCs w:val="24"/>
-        </w:rPr>
-      </w:pPr>
-      <w:r>
-        <w:rPr>
-          <w:sz w:val="24"/>
-          <w:szCs w:val="24"/>
-        </w:rPr>
-        <w:t>From the results, it was observed that each method has its own advantages. Content-based filtering works well when item features are available, while collaborative filtering is better for capturing patterns from user ratings. SVD gave better performance in terms of prediction accuracy and produced more personalized recommendations. Overall, this assignment helped in understanding how recommender systems work, how different techniques are implemented, and how they can be compared using evaluation metrics like RMSE.</w:t>
-      </w:r>
-    </w:p>
-    <w:p>
-      <w:pPr>
-        <w:jc w:val="both"/>
-        <w:rPr>
-          <w:sz w:val="24"/>
-          <w:szCs w:val="24"/>
-        </w:rPr>
-      </w:pPr>
-      <w:r>
-        <w:rPr>
-          <w:sz w:val="24"/>
-          <w:szCs w:val="24"/>
-        </w:rPr>
-        <w:t>Main learnings from this assignment:</w:t>
-      </w:r>
-    </w:p>
-    <w:p>
-      <w:pPr>
-        <w:numPr>
-          <w:ilvl w:val="0"/>
-          <w:numId w:val="1"/>
-        </w:numPr>
-        <w:jc w:val="both"/>
-        <w:rPr>
-          <w:sz w:val="24"/>
-          <w:szCs w:val="24"/>
-        </w:rPr>
-      </w:pPr>
-      <w:r>
-        <w:rPr>
-          <w:sz w:val="24"/>
-          <w:szCs w:val="24"/>
-        </w:rPr>
-        <w:t>Understood the concept of content-based and collaborative filtering</w:t>
-      </w:r>
-    </w:p>
-    <w:p>
-      <w:pPr>
-        <w:numPr>
-          <w:ilvl w:val="0"/>
-          <w:numId w:val="1"/>
-        </w:numPr>
-        <w:jc w:val="both"/>
-        <w:rPr>
-          <w:sz w:val="24"/>
-          <w:szCs w:val="24"/>
-        </w:rPr>
-      </w:pPr>
-      <w:r>
-        <w:rPr>
-          <w:sz w:val="24"/>
-          <w:szCs w:val="24"/>
-        </w:rPr>
-        <w:t>Learned how TF-IDF and cosine similarity can be used for recommendations</w:t>
-      </w:r>
-    </w:p>
-    <w:p>
-      <w:pPr>
-        <w:numPr>
-          <w:ilvl w:val="0"/>
-          <w:numId w:val="1"/>
-        </w:numPr>
-        <w:jc w:val="both"/>
-        <w:rPr>
-          <w:sz w:val="24"/>
-          <w:szCs w:val="24"/>
-        </w:rPr>
-      </w:pPr>
-      <w:r>
-        <w:rPr>
-          <w:sz w:val="24"/>
-          <w:szCs w:val="24"/>
-        </w:rPr>
-        <w:t>Built user-profile-based personalized recommendations</w:t>
-      </w:r>
-    </w:p>
-    <w:p>
-      <w:pPr>
-        <w:numPr>
-          <w:ilvl w:val="0"/>
-          <w:numId w:val="1"/>
-        </w:numPr>
-        <w:jc w:val="both"/>
-        <w:rPr>
-          <w:sz w:val="24"/>
-          <w:szCs w:val="24"/>
-        </w:rPr>
-      </w:pPr>
-      <w:r>
-        <w:rPr>
-          <w:sz w:val="24"/>
-          <w:szCs w:val="24"/>
-        </w:rPr>
-        <w:t>Implemented user-based collaborative filtering and SVD</w:t>
-      </w:r>
-    </w:p>
-    <w:p>
-      <w:pPr>
-        <w:numPr>
-          <w:ilvl w:val="0"/>
-          <w:numId w:val="1"/>
-        </w:numPr>
-        <w:jc w:val="both"/>
-        <w:rPr>
-          <w:sz w:val="24"/>
-          <w:szCs w:val="24"/>
-        </w:rPr>
-      </w:pPr>
-      <w:r>
-        <w:rPr>
-          <w:sz w:val="24"/>
-          <w:szCs w:val="24"/>
-        </w:rPr>
-        <w:t>Compared different recommender models using RMSE</w:t>
-      </w:r>
-    </w:p>
-    <w:p>
-      <w:pPr>
-        <w:numPr>
-          <w:ilvl w:val="0"/>
-          <w:numId w:val="1"/>
-        </w:numPr>
-        <w:jc w:val="both"/>
-        <w:rPr>
-          <w:sz w:val="24"/>
-          <w:szCs w:val="24"/>
-        </w:rPr>
-      </w:pPr>
-      <w:r>
-        <w:rPr>
-          <w:sz w:val="24"/>
-          <w:szCs w:val="24"/>
-        </w:rPr>
-        <w:t>Gained practical understanding of recommendation system design</w:t>
-      </w:r>
-    </w:p>
-    <w:p>
-      <w:pPr>
-        <w:jc w:val="both"/>
-        <w:rPr>
-          <w:b/>
-          <w:bCs/>
-          <w:sz w:val="28"/>
-          <w:szCs w:val="28"/>
-        </w:rPr>
-      </w:pPr>
+        <w:t>This assignment covered a wide range of recommender system techniques, starting from basic content-based filtering all the way to neural networks, reinforcement learning, and explainability methods. Here is a summary of what was built and what was learned.</w:t>
+      </w:r>
+    </w:p>
+    <w:p>
+      <w:pPr>
+        <w:jc w:val="both"/>
+        <w:rPr>
+          <w:sz w:val="24"/>
+          <w:szCs w:val="24"/>
+        </w:rPr>
+      </w:pPr>
+      <w:r>
+        <w:rPr>
+          <w:b/>
+          <w:bCs/>
+          <w:sz w:val="24"/>
+          <w:szCs w:val="24"/>
+        </w:rPr>
+        <w:t>What was implemented:</w:t>
+      </w:r>
+    </w:p>
+    <w:tbl>
+      <w:tblPr>
+        <w:tblStyle w:val="TableGrid"/>
+        <w:tblW w:w="0" w:type="auto"/>
+        <w:tblLook w:val="04A0" w:firstRow="1" w:lastRow="0" w:firstColumn="1" w:lastColumn="0" w:noHBand="0" w:noVBand="1"/>
+      </w:tblPr>
+      <w:tblGrid>
+        <w:gridCol w:w="707"/>
+        <w:gridCol w:w="2354"/>
+        <w:gridCol w:w="5955"/>
+      </w:tblGrid>
+      <w:tr>
+        <w:tc>
+          <w:tcPr>
+            <w:tcW w:w="0" w:type="auto"/>
+            <w:hideMark/>
+          </w:tcPr>
+          <w:p>
+            <w:pPr>
+              <w:spacing w:after="160"/>
+              <w:jc w:val="both"/>
+              <w:rPr>
+                <w:b/>
+                <w:bCs/>
+                <w:sz w:val="24"/>
+                <w:szCs w:val="24"/>
+              </w:rPr>
+            </w:pPr>
+            <w:r>
+              <w:rPr>
+                <w:b/>
+                <w:bCs/>
+                <w:sz w:val="24"/>
+                <w:szCs w:val="24"/>
+              </w:rPr>
+              <w:t>Task</w:t>
+            </w:r>
+          </w:p>
+        </w:tc>
+        <w:tc>
+          <w:tcPr>
+            <w:tcW w:w="0" w:type="auto"/>
+            <w:hideMark/>
+          </w:tcPr>
+          <w:p>
+            <w:pPr>
+              <w:spacing w:after="160"/>
+              <w:jc w:val="both"/>
+              <w:rPr>
+                <w:b/>
+                <w:bCs/>
+                <w:sz w:val="24"/>
+                <w:szCs w:val="24"/>
+              </w:rPr>
+            </w:pPr>
+            <w:r>
+              <w:rPr>
+                <w:b/>
+                <w:bCs/>
+                <w:sz w:val="24"/>
+                <w:szCs w:val="24"/>
+              </w:rPr>
+              <w:t>Method</w:t>
+            </w:r>
+          </w:p>
+        </w:tc>
+        <w:tc>
+          <w:tcPr>
+            <w:tcW w:w="0" w:type="auto"/>
+            <w:hideMark/>
+          </w:tcPr>
+          <w:p>
+            <w:pPr>
+              <w:spacing w:after="160"/>
+              <w:jc w:val="both"/>
+              <w:rPr>
+                <w:b/>
+                <w:bCs/>
+                <w:sz w:val="24"/>
+                <w:szCs w:val="24"/>
+              </w:rPr>
+            </w:pPr>
+            <w:r>
+              <w:rPr>
+                <w:b/>
+                <w:bCs/>
+                <w:sz w:val="24"/>
+                <w:szCs w:val="24"/>
+              </w:rPr>
+              <w:t>Key Finding</w:t>
+            </w:r>
+          </w:p>
+        </w:tc>
+      </w:tr>
+      <w:tr>
+        <w:tc>
+          <w:tcPr>
+            <w:tcW w:w="0" w:type="auto"/>
+            <w:hideMark/>
+          </w:tcPr>
+          <w:p>
+            <w:pPr>
+              <w:spacing w:after="160"/>
+              <w:jc w:val="both"/>
+              <w:rPr>
+                <w:sz w:val="24"/>
+                <w:szCs w:val="24"/>
+              </w:rPr>
+            </w:pPr>
+            <w:r>
+              <w:rPr>
+                <w:sz w:val="24"/>
+                <w:szCs w:val="24"/>
+              </w:rPr>
+              <w:t>1 &amp; 2</w:t>
+            </w:r>
+          </w:p>
+        </w:tc>
+        <w:tc>
+          <w:tcPr>
+            <w:tcW w:w="0" w:type="auto"/>
+            <w:hideMark/>
+          </w:tcPr>
+          <w:p>
+            <w:pPr>
+              <w:spacing w:after="160"/>
+              <w:jc w:val="both"/>
+              <w:rPr>
+                <w:sz w:val="24"/>
+                <w:szCs w:val="24"/>
+              </w:rPr>
+            </w:pPr>
+            <w:r>
+              <w:rPr>
+                <w:sz w:val="24"/>
+                <w:szCs w:val="24"/>
+              </w:rPr>
+              <w:t>TF-IDF + User Profile CBF</w:t>
+            </w:r>
+          </w:p>
+        </w:tc>
+        <w:tc>
+          <w:tcPr>
+            <w:tcW w:w="0" w:type="auto"/>
+            <w:hideMark/>
+          </w:tcPr>
+          <w:p>
+            <w:pPr>
+              <w:spacing w:after="160"/>
+              <w:jc w:val="both"/>
+              <w:rPr>
+                <w:sz w:val="24"/>
+                <w:szCs w:val="24"/>
+              </w:rPr>
+            </w:pPr>
+            <w:r>
+              <w:rPr>
+                <w:sz w:val="24"/>
+                <w:szCs w:val="24"/>
+              </w:rPr>
+              <w:t>Genre similarity works well for finding similar movies, but misses personal taste nuances</w:t>
+            </w:r>
+          </w:p>
+        </w:tc>
+      </w:tr>
+      <w:tr>
+        <w:tc>
+          <w:tcPr>
+            <w:tcW w:w="0" w:type="auto"/>
+            <w:hideMark/>
+          </w:tcPr>
+          <w:p>
+            <w:pPr>
+              <w:spacing w:after="160"/>
+              <w:jc w:val="both"/>
+              <w:rPr>
+                <w:sz w:val="24"/>
+                <w:szCs w:val="24"/>
+              </w:rPr>
+            </w:pPr>
+            <w:r>
+              <w:rPr>
+                <w:sz w:val="24"/>
+                <w:szCs w:val="24"/>
+              </w:rPr>
+              <w:t>3 &amp; 4</w:t>
+            </w:r>
+          </w:p>
+        </w:tc>
+        <w:tc>
+          <w:tcPr>
+            <w:tcW w:w="0" w:type="auto"/>
+            <w:hideMark/>
+          </w:tcPr>
+          <w:p>
+            <w:pPr>
+              <w:spacing w:after="160"/>
+              <w:jc w:val="both"/>
+              <w:rPr>
+                <w:sz w:val="24"/>
+                <w:szCs w:val="24"/>
+              </w:rPr>
+            </w:pPr>
+            <w:r>
+              <w:rPr>
+                <w:sz w:val="24"/>
+                <w:szCs w:val="24"/>
+              </w:rPr>
+              <w:t>User-Based &amp; Item-Based CF</w:t>
+            </w:r>
+          </w:p>
+        </w:tc>
+        <w:tc>
+          <w:tcPr>
+            <w:tcW w:w="0" w:type="auto"/>
+            <w:hideMark/>
+          </w:tcPr>
+          <w:p>
+            <w:pPr>
+              <w:spacing w:after="160"/>
+              <w:jc w:val="both"/>
+              <w:rPr>
+                <w:sz w:val="24"/>
+                <w:szCs w:val="24"/>
+              </w:rPr>
+            </w:pPr>
+            <w:r>
+              <w:rPr>
+                <w:sz w:val="24"/>
+                <w:szCs w:val="24"/>
+              </w:rPr>
+              <w:t>Pearson correlation outperforms cosine similarity; item-based CF is more scalable in practice</w:t>
+            </w:r>
+          </w:p>
+        </w:tc>
+      </w:tr>
+      <w:tr>
+        <w:tc>
+          <w:tcPr>
+            <w:tcW w:w="0" w:type="auto"/>
+            <w:hideMark/>
+          </w:tcPr>
+          <w:p>
+            <w:pPr>
+              <w:spacing w:after="160"/>
+              <w:jc w:val="both"/>
+              <w:rPr>
+                <w:sz w:val="24"/>
+                <w:szCs w:val="24"/>
+              </w:rPr>
+            </w:pPr>
+            <w:r>
+              <w:rPr>
+                <w:sz w:val="24"/>
+                <w:szCs w:val="24"/>
+              </w:rPr>
+              <w:t>5 &amp; 6</w:t>
+            </w:r>
+          </w:p>
+        </w:tc>
+        <w:tc>
+          <w:tcPr>
+            <w:tcW w:w="0" w:type="auto"/>
+            <w:hideMark/>
+          </w:tcPr>
+          <w:p>
+            <w:pPr>
+              <w:spacing w:after="160"/>
+              <w:jc w:val="both"/>
+              <w:rPr>
+                <w:sz w:val="24"/>
+                <w:szCs w:val="24"/>
+              </w:rPr>
+            </w:pPr>
+            <w:r>
+              <w:rPr>
+                <w:sz w:val="24"/>
+                <w:szCs w:val="24"/>
+              </w:rPr>
+              <w:t>SVD (scratch + Surprise)</w:t>
+            </w:r>
+          </w:p>
+        </w:tc>
+        <w:tc>
+          <w:tcPr>
+            <w:tcW w:w="0" w:type="auto"/>
+            <w:hideMark/>
+          </w:tcPr>
+          <w:p>
+            <w:pPr>
+              <w:spacing w:after="160"/>
+              <w:jc w:val="both"/>
+              <w:rPr>
+                <w:sz w:val="24"/>
+                <w:szCs w:val="24"/>
+              </w:rPr>
+            </w:pPr>
+            <w:r>
+              <w:rPr>
+                <w:sz w:val="24"/>
+                <w:szCs w:val="24"/>
+              </w:rPr>
+              <w:t>Surprise SVD beats scratch SVD because it learns user and item biases; tuning helps further</w:t>
+            </w:r>
+          </w:p>
+        </w:tc>
+      </w:tr>
+      <w:tr>
+        <w:tc>
+          <w:tcPr>
+            <w:tcW w:w="0" w:type="auto"/>
+            <w:hideMark/>
+          </w:tcPr>
+          <w:p>
+            <w:pPr>
+              <w:spacing w:after="160"/>
+              <w:jc w:val="both"/>
+              <w:rPr>
+                <w:sz w:val="24"/>
+                <w:szCs w:val="24"/>
+              </w:rPr>
+            </w:pPr>
+            <w:r>
+              <w:rPr>
+                <w:sz w:val="24"/>
+                <w:szCs w:val="24"/>
+              </w:rPr>
+              <w:t>7</w:t>
+            </w:r>
+          </w:p>
+        </w:tc>
+        <w:tc>
+          <w:tcPr>
+            <w:tcW w:w="0" w:type="auto"/>
+            <w:hideMark/>
+          </w:tcPr>
+          <w:p>
+            <w:pPr>
+              <w:spacing w:after="160"/>
+              <w:jc w:val="both"/>
+              <w:rPr>
+                <w:sz w:val="24"/>
+                <w:szCs w:val="24"/>
+              </w:rPr>
+            </w:pPr>
+            <w:r>
+              <w:rPr>
+                <w:sz w:val="24"/>
+                <w:szCs w:val="24"/>
+              </w:rPr>
+              <w:t>Hybrid Meta-Model</w:t>
+            </w:r>
+          </w:p>
+        </w:tc>
+        <w:tc>
+          <w:tcPr>
+            <w:tcW w:w="0" w:type="auto"/>
+            <w:hideMark/>
+          </w:tcPr>
+          <w:p>
+            <w:pPr>
+              <w:spacing w:after="160"/>
+              <w:jc w:val="both"/>
+              <w:rPr>
+                <w:sz w:val="24"/>
+                <w:szCs w:val="24"/>
+              </w:rPr>
+            </w:pPr>
+            <w:r>
+              <w:rPr>
+                <w:sz w:val="24"/>
+                <w:szCs w:val="24"/>
+              </w:rPr>
+              <w:t>Combining CBF and CF scores with Gradient Boosting improves accuracy; cold-start users remain a problem</w:t>
+            </w:r>
+          </w:p>
+        </w:tc>
+      </w:tr>
+      <w:tr>
+        <w:tc>
+          <w:tcPr>
+            <w:tcW w:w="0" w:type="auto"/>
+            <w:hideMark/>
+          </w:tcPr>
+          <w:p>
+            <w:pPr>
+              <w:spacing w:after="160"/>
+              <w:jc w:val="both"/>
+              <w:rPr>
+                <w:sz w:val="24"/>
+                <w:szCs w:val="24"/>
+              </w:rPr>
+            </w:pPr>
+            <w:r>
+              <w:rPr>
+                <w:sz w:val="24"/>
+                <w:szCs w:val="24"/>
+              </w:rPr>
+              <w:t>8</w:t>
+            </w:r>
+          </w:p>
+        </w:tc>
+        <w:tc>
+          <w:tcPr>
+            <w:tcW w:w="0" w:type="auto"/>
+            <w:hideMark/>
+          </w:tcPr>
+          <w:p>
+            <w:pPr>
+              <w:spacing w:after="160"/>
+              <w:jc w:val="both"/>
+              <w:rPr>
+                <w:sz w:val="24"/>
+                <w:szCs w:val="24"/>
+              </w:rPr>
+            </w:pPr>
+            <w:r>
+              <w:rPr>
+                <w:sz w:val="24"/>
+                <w:szCs w:val="24"/>
+              </w:rPr>
+              <w:t>Neural Network CBF</w:t>
+            </w:r>
+          </w:p>
+        </w:tc>
+        <w:tc>
+          <w:tcPr>
+            <w:tcW w:w="0" w:type="auto"/>
+            <w:hideMark/>
+          </w:tcPr>
+          <w:p>
+            <w:pPr>
+              <w:spacing w:after="160"/>
+              <w:jc w:val="both"/>
+              <w:rPr>
+                <w:sz w:val="24"/>
+                <w:szCs w:val="24"/>
+              </w:rPr>
+            </w:pPr>
+            <w:r>
+              <w:rPr>
+                <w:sz w:val="24"/>
+                <w:szCs w:val="24"/>
+              </w:rPr>
+              <w:t>MLP learns genre preferences better than cosine similarity but needs enough training data</w:t>
+            </w:r>
+          </w:p>
+        </w:tc>
+      </w:tr>
+      <w:tr>
+        <w:tc>
+          <w:tcPr>
+            <w:tcW w:w="0" w:type="auto"/>
+            <w:hideMark/>
+          </w:tcPr>
+          <w:p>
+            <w:pPr>
+              <w:spacing w:after="160"/>
+              <w:jc w:val="both"/>
+              <w:rPr>
+                <w:sz w:val="24"/>
+                <w:szCs w:val="24"/>
+              </w:rPr>
+            </w:pPr>
+            <w:r>
+              <w:rPr>
+                <w:sz w:val="24"/>
+                <w:szCs w:val="24"/>
+              </w:rPr>
+              <w:t>9</w:t>
+            </w:r>
+          </w:p>
+        </w:tc>
+        <w:tc>
+          <w:tcPr>
+            <w:tcW w:w="0" w:type="auto"/>
+            <w:hideMark/>
+          </w:tcPr>
+          <w:p>
+            <w:pPr>
+              <w:spacing w:after="160"/>
+              <w:jc w:val="both"/>
+              <w:rPr>
+                <w:sz w:val="24"/>
+                <w:szCs w:val="24"/>
+              </w:rPr>
+            </w:pPr>
+            <w:r>
+              <w:rPr>
+                <w:sz w:val="24"/>
+                <w:szCs w:val="24"/>
+              </w:rPr>
+              <w:t>Reinforcement Learning</w:t>
+            </w:r>
+          </w:p>
+        </w:tc>
+        <w:tc>
+          <w:tcPr>
+            <w:tcW w:w="0" w:type="auto"/>
+            <w:hideMark/>
+          </w:tcPr>
+          <w:p>
+            <w:pPr>
+              <w:spacing w:after="160"/>
+              <w:jc w:val="both"/>
+              <w:rPr>
+                <w:sz w:val="24"/>
+                <w:szCs w:val="24"/>
+              </w:rPr>
+            </w:pPr>
+            <w:r>
+              <w:rPr>
+                <w:sz w:val="24"/>
+                <w:szCs w:val="24"/>
+              </w:rPr>
+              <w:t>UCB strategy beats ε-Greedy; RL optimises long-term engagement unlike traditional models</w:t>
+            </w:r>
+          </w:p>
+        </w:tc>
+      </w:tr>
+      <w:tr>
+        <w:tc>
+          <w:tcPr>
+            <w:tcW w:w="0" w:type="auto"/>
+            <w:hideMark/>
+          </w:tcPr>
+          <w:p>
+            <w:pPr>
+              <w:spacing w:after="160"/>
+              <w:jc w:val="both"/>
+              <w:rPr>
+                <w:sz w:val="24"/>
+                <w:szCs w:val="24"/>
+              </w:rPr>
+            </w:pPr>
+            <w:r>
+              <w:rPr>
+                <w:sz w:val="24"/>
+                <w:szCs w:val="24"/>
+              </w:rPr>
+              <w:t>10-12</w:t>
+            </w:r>
+          </w:p>
+        </w:tc>
+        <w:tc>
+          <w:tcPr>
+            <w:tcW w:w="0" w:type="auto"/>
+            <w:hideMark/>
+          </w:tcPr>
+          <w:p>
+            <w:pPr>
+              <w:spacing w:after="160"/>
+              <w:jc w:val="both"/>
+              <w:rPr>
+                <w:sz w:val="24"/>
+                <w:szCs w:val="24"/>
+              </w:rPr>
+            </w:pPr>
+            <w:r>
+              <w:rPr>
+                <w:sz w:val="24"/>
+                <w:szCs w:val="24"/>
+              </w:rPr>
+              <w:t>SHAP, Neighbourhood, LIME</w:t>
+            </w:r>
+          </w:p>
+        </w:tc>
+        <w:tc>
+          <w:tcPr>
+            <w:tcW w:w="0" w:type="auto"/>
+            <w:hideMark/>
+          </w:tcPr>
+          <w:p>
+            <w:pPr>
+              <w:spacing w:after="160"/>
+              <w:jc w:val="both"/>
+              <w:rPr>
+                <w:sz w:val="24"/>
+                <w:szCs w:val="24"/>
+              </w:rPr>
+            </w:pPr>
+            <w:r>
+              <w:rPr>
+                <w:sz w:val="24"/>
+                <w:szCs w:val="24"/>
+              </w:rPr>
+              <w:t>All three methods explain recommendations from different angles</w:t>
+            </w:r>
+          </w:p>
+        </w:tc>
+      </w:tr>
+      <w:tr>
+        <w:tc>
+          <w:tcPr>
+            <w:tcW w:w="0" w:type="auto"/>
+            <w:hideMark/>
+          </w:tcPr>
+          <w:p>
+            <w:pPr>
+              <w:spacing w:after="160"/>
+              <w:jc w:val="both"/>
+              <w:rPr>
+                <w:sz w:val="24"/>
+                <w:szCs w:val="24"/>
+              </w:rPr>
+            </w:pPr>
+            <w:r>
+              <w:rPr>
+                <w:sz w:val="24"/>
+                <w:szCs w:val="24"/>
+              </w:rPr>
+              <w:t>13</w:t>
+            </w:r>
+          </w:p>
+        </w:tc>
+        <w:tc>
+          <w:tcPr>
+            <w:tcW w:w="0" w:type="auto"/>
+            <w:hideMark/>
+          </w:tcPr>
+          <w:p>
+            <w:pPr>
+              <w:spacing w:after="160"/>
+              <w:jc w:val="both"/>
+              <w:rPr>
+                <w:sz w:val="24"/>
+                <w:szCs w:val="24"/>
+              </w:rPr>
+            </w:pPr>
+            <w:r>
+              <w:rPr>
+                <w:sz w:val="24"/>
+                <w:szCs w:val="24"/>
+              </w:rPr>
+              <w:t>Explainability Evaluation</w:t>
+            </w:r>
+          </w:p>
+        </w:tc>
+        <w:tc>
+          <w:tcPr>
+            <w:tcW w:w="0" w:type="auto"/>
+            <w:hideMark/>
+          </w:tcPr>
+          <w:p>
+            <w:pPr>
+              <w:spacing w:after="160"/>
+              <w:jc w:val="both"/>
+              <w:rPr>
+                <w:sz w:val="24"/>
+                <w:szCs w:val="24"/>
+              </w:rPr>
+            </w:pPr>
+            <w:r>
+              <w:rPr>
+                <w:sz w:val="24"/>
+                <w:szCs w:val="24"/>
+              </w:rPr>
+              <w:t>Popularity bias was detected across all models</w:t>
+            </w:r>
+          </w:p>
+        </w:tc>
+      </w:tr>
+    </w:tbl>
+    <w:p>
+      <w:pPr>
+        <w:jc w:val="both"/>
+        <w:rPr>
+          <w:sz w:val="24"/>
+          <w:szCs w:val="24"/>
+        </w:rPr>
+      </w:pPr>
+      <w:r>
+        <w:rPr>
+          <w:b/>
+          <w:bCs/>
+          <w:sz w:val="24"/>
+          <w:szCs w:val="24"/>
+        </w:rPr>
+        <w:t>Overall Takeaways</w:t>
+      </w:r>
+    </w:p>
+    <w:p>
+      <w:pPr>
+        <w:jc w:val="both"/>
+        <w:rPr>
+          <w:sz w:val="24"/>
+          <w:szCs w:val="24"/>
+        </w:rPr>
+      </w:pPr>
+      <w:r>
+        <w:rPr>
+          <w:sz w:val="24"/>
+          <w:szCs w:val="24"/>
+        </w:rPr>
+        <w:t>Model-based methods like SVD and the hybrid meta-model consistently gave better results than memory-based methods like basic user-based CF. The more data a user has, the better every model performs — cold-start users are still a hard problem across all approaches.</w:t>
+      </w:r>
+    </w:p>
+    <w:p>
+      <w:pPr>
+        <w:jc w:val="both"/>
+        <w:rPr>
+          <w:sz w:val="24"/>
+          <w:szCs w:val="24"/>
+        </w:rPr>
+      </w:pPr>
+      <w:r>
+        <w:rPr>
+          <w:sz w:val="24"/>
+          <w:szCs w:val="24"/>
+        </w:rPr>
+        <w:t>The explainability section was particularly interesting. SHAP showed that the CF score and movie popularity are the two biggest drivers of predictions. Neighbourhood explanations were the easiest to understand from a user's perspective. LIME was useful for explaining the neural network but was less consistent across different predictions.</w:t>
+      </w:r>
+    </w:p>
+    <w:p>
+      <w:pPr>
+        <w:jc w:val="both"/>
+        <w:rPr>
+          <w:sz w:val="24"/>
+          <w:szCs w:val="24"/>
+        </w:rPr>
+      </w:pPr>
+      <w:r>
+        <w:rPr>
+          <w:sz w:val="24"/>
+          <w:szCs w:val="24"/>
+        </w:rPr>
+        <w:t xml:space="preserve">One key finding across all tasks was </w:t>
+      </w:r>
+      <w:r>
+        <w:rPr>
+          <w:b/>
+          <w:bCs/>
+          <w:sz w:val="24"/>
+          <w:szCs w:val="24"/>
+        </w:rPr>
+        <w:t>popularity bias</w:t>
+      </w:r>
+      <w:r>
+        <w:rPr>
+          <w:sz w:val="24"/>
+          <w:szCs w:val="24"/>
+        </w:rPr>
+        <w:t xml:space="preserve"> — the models tend to recommend already-popular movies more often, which is a known problem in recommender systems. A possible fix would be to add diversity-aware ranking in future work.</w:t>
+      </w:r>
+    </w:p>
+    <w:p>
+      <w:pPr>
+        <w:jc w:val="both"/>
+        <w:rPr>
+          <w:sz w:val="24"/>
+          <w:szCs w:val="24"/>
+        </w:rPr>
+      </w:pPr>
+      <w:r>
+        <w:rPr>
+          <w:sz w:val="24"/>
+          <w:szCs w:val="24"/>
+        </w:rPr>
+        <w:t>Overall, this assignment showed that there is no single best recommender system. The right choice depends on how much data is available, how interpretable the system needs to be, and whether the goal is short-term accuracy or long-term user engagement.</w:t>
+      </w:r>
     </w:p>
     <w:sectPr>
       <w:pgSz w:w="11906" w:h="16838"/>

</xml_diff>